<commit_message>
Add Laravel notes & practice files:Laravel views
</commit_message>
<xml_diff>
--- a/Laravel-Learning/Laravel notes.docx
+++ b/Laravel-Learning/Laravel notes.docx
@@ -1867,10 +1867,7 @@
         <w:t xml:space="preserve"> folder</w:t>
       </w:r>
       <w:r>
-        <w:t xml:space="preserve"> refers to the settings, parameters, and options used to define how a software system behaves without changing its source </w:t>
-      </w:r>
-      <w:r>
-        <w:t>code.</w:t>
+        <w:t xml:space="preserve"> refers to the settings, parameters, and options used to define how a software system behaves without changing its source code.</w:t>
       </w:r>
     </w:p>
     <w:p>
@@ -2043,6 +2040,10 @@
         <w:t xml:space="preserve"> file is responsible for the </w:t>
       </w:r>
       <w:r>
+        <w:rPr>
+          <w:noProof/>
+          <w:lang w:eastAsia="en-IN"/>
+        </w:rPr>
         <w:drawing>
           <wp:inline distT="0" distB="0" distL="0" distR="0" wp14:anchorId="765F8480" wp14:editId="2A2E3275">
             <wp:extent cx="1174561" cy="159026"/>
@@ -3215,8 +3216,672 @@
           <w:szCs w:val="22"/>
         </w:rPr>
       </w:pPr>
+    </w:p>
+    <w:p>
+      <w:pPr>
+        <w:rPr>
+          <w:b/>
+          <w:bCs/>
+          <w:color w:val="FF0000"/>
+          <w:sz w:val="40"/>
+          <w:szCs w:val="40"/>
+          <w:u w:val="single"/>
+        </w:rPr>
+      </w:pPr>
+      <w:r>
+        <w:rPr>
+          <w:b/>
+          <w:bCs/>
+          <w:color w:val="FF0000"/>
+          <w:sz w:val="40"/>
+          <w:szCs w:val="40"/>
+          <w:u w:val="single"/>
+        </w:rPr>
+        <w:t>View:</w:t>
+      </w:r>
+    </w:p>
+    <w:p>
+      <w:pPr>
+        <w:rPr>
+          <w:b/>
+          <w:bCs/>
+          <w:color w:val="FF0000"/>
+          <w:szCs w:val="22"/>
+        </w:rPr>
+      </w:pPr>
+      <w:r>
+        <w:rPr>
+          <w:b/>
+          <w:bCs/>
+          <w:color w:val="FF0000"/>
+          <w:szCs w:val="22"/>
+        </w:rPr>
+        <w:t xml:space="preserve">In </w:t>
+      </w:r>
+      <w:proofErr w:type="spellStart"/>
+      <w:r>
+        <w:rPr>
+          <w:b/>
+          <w:bCs/>
+          <w:color w:val="FF0000"/>
+          <w:szCs w:val="22"/>
+        </w:rPr>
+        <w:t>Laravel</w:t>
+      </w:r>
+      <w:proofErr w:type="spellEnd"/>
+      <w:r>
+        <w:rPr>
+          <w:b/>
+          <w:bCs/>
+          <w:color w:val="FF0000"/>
+          <w:szCs w:val="22"/>
+        </w:rPr>
+        <w:t>, a View is the "V" in the Model-View-Controller (MVC) architecture. It is respons</w:t>
+      </w:r>
+      <w:r>
+        <w:rPr>
+          <w:b/>
+          <w:bCs/>
+          <w:color w:val="FF0000"/>
+          <w:szCs w:val="22"/>
+        </w:rPr>
+        <w:t xml:space="preserve">ible for the presentation layer - </w:t>
+      </w:r>
+      <w:r>
+        <w:rPr>
+          <w:b/>
+          <w:bCs/>
+          <w:color w:val="FF0000"/>
+          <w:szCs w:val="22"/>
+        </w:rPr>
+        <w:t>the actual HTML, CSS, and UI elements that users see and interact with in their browser.</w:t>
+      </w:r>
+    </w:p>
+    <w:p>
+      <w:pPr>
+        <w:rPr>
+          <w:b/>
+          <w:bCs/>
+          <w:color w:val="FF0000"/>
+          <w:szCs w:val="22"/>
+        </w:rPr>
+      </w:pPr>
+      <w:r>
+        <w:rPr>
+          <w:b/>
+          <w:bCs/>
+          <w:color w:val="FF0000"/>
+          <w:szCs w:val="22"/>
+        </w:rPr>
+        <w:t>Instead of writing long HTML strings inside your application logic (controllers), views allow you to separate your design from your code.</w:t>
+      </w:r>
+    </w:p>
+    <w:p>
+      <w:pPr>
+        <w:rPr>
+          <w:b/>
+          <w:bCs/>
+          <w:color w:val="FF0000"/>
+          <w:szCs w:val="22"/>
+        </w:rPr>
+      </w:pPr>
+    </w:p>
+    <w:p>
+      <w:pPr>
+        <w:rPr>
+          <w:szCs w:val="22"/>
+        </w:rPr>
+      </w:pPr>
+      <w:r>
+        <w:rPr>
+          <w:b/>
+          <w:bCs/>
+          <w:szCs w:val="22"/>
+        </w:rPr>
+        <w:t>Note</w:t>
+      </w:r>
+      <w:proofErr w:type="gramStart"/>
+      <w:r>
+        <w:rPr>
+          <w:b/>
+          <w:bCs/>
+          <w:szCs w:val="22"/>
+        </w:rPr>
+        <w:t>:-</w:t>
+      </w:r>
+      <w:proofErr w:type="gramEnd"/>
+      <w:r>
+        <w:rPr>
+          <w:b/>
+          <w:bCs/>
+          <w:szCs w:val="22"/>
+        </w:rPr>
+        <w:t xml:space="preserve"> </w:t>
+      </w:r>
+      <w:r>
+        <w:rPr>
+          <w:szCs w:val="22"/>
+        </w:rPr>
+        <w:t xml:space="preserve">Always name the view file in lower case not necessary but just a </w:t>
+      </w:r>
+      <w:proofErr w:type="spellStart"/>
+      <w:r>
+        <w:rPr>
+          <w:szCs w:val="22"/>
+        </w:rPr>
+        <w:t>gloabal</w:t>
+      </w:r>
+      <w:proofErr w:type="spellEnd"/>
+      <w:r>
+        <w:rPr>
+          <w:szCs w:val="22"/>
+        </w:rPr>
+        <w:t xml:space="preserve"> standard</w:t>
+      </w:r>
+      <w:r>
+        <w:rPr>
+          <w:szCs w:val="22"/>
+        </w:rPr>
+        <w:t xml:space="preserve"> better to follow</w:t>
+      </w:r>
+      <w:r>
+        <w:rPr>
+          <w:szCs w:val="22"/>
+        </w:rPr>
+        <w:t>.</w:t>
+      </w:r>
+    </w:p>
+    <w:p>
+      <w:pPr>
+        <w:rPr>
+          <w:szCs w:val="22"/>
+        </w:rPr>
+      </w:pPr>
+      <w:r>
+        <w:rPr>
+          <w:noProof/>
+          <w:lang w:eastAsia="en-IN"/>
+        </w:rPr>
+        <w:drawing>
+          <wp:inline distT="0" distB="0" distL="0" distR="0" wp14:anchorId="25CEC4E3" wp14:editId="7A359E0D">
+            <wp:extent cx="3288831" cy="1849967"/>
+            <wp:effectExtent l="0" t="0" r="6985" b="0"/>
+            <wp:docPr id="4" name="Picture 4"/>
+            <wp:cNvGraphicFramePr>
+              <a:graphicFrameLocks xmlns:a="http://schemas.openxmlformats.org/drawingml/2006/main" noChangeAspect="1"/>
+            </wp:cNvGraphicFramePr>
+            <a:graphic xmlns:a="http://schemas.openxmlformats.org/drawingml/2006/main">
+              <a:graphicData uri="http://schemas.openxmlformats.org/drawingml/2006/picture">
+                <pic:pic xmlns:pic="http://schemas.openxmlformats.org/drawingml/2006/picture">
+                  <pic:nvPicPr>
+                    <pic:cNvPr id="0" name=""/>
+                    <pic:cNvPicPr/>
+                  </pic:nvPicPr>
+                  <pic:blipFill>
+                    <a:blip r:embed="rId13"/>
+                    <a:stretch>
+                      <a:fillRect/>
+                    </a:stretch>
+                  </pic:blipFill>
+                  <pic:spPr>
+                    <a:xfrm>
+                      <a:off x="0" y="0"/>
+                      <a:ext cx="3288588" cy="1849830"/>
+                    </a:xfrm>
+                    <a:prstGeom prst="rect">
+                      <a:avLst/>
+                    </a:prstGeom>
+                  </pic:spPr>
+                </pic:pic>
+              </a:graphicData>
+            </a:graphic>
+          </wp:inline>
+        </w:drawing>
+      </w:r>
+    </w:p>
+    <w:p>
+      <w:pPr>
+        <w:rPr>
+          <w:b/>
+          <w:bCs/>
+          <w:szCs w:val="22"/>
+        </w:rPr>
+      </w:pPr>
+    </w:p>
+    <w:p>
+      <w:pPr>
+        <w:rPr>
+          <w:b/>
+          <w:bCs/>
+          <w:szCs w:val="22"/>
+        </w:rPr>
+      </w:pPr>
+      <w:r>
+        <w:rPr>
+          <w:b/>
+          <w:bCs/>
+          <w:szCs w:val="22"/>
+        </w:rPr>
+        <w:lastRenderedPageBreak/>
+        <w:t>Syntax to make a view using CLI:-</w:t>
+      </w:r>
+    </w:p>
+    <w:p>
+      <w:pPr>
+        <w:rPr>
+          <w:b/>
+          <w:bCs/>
+          <w:szCs w:val="22"/>
+        </w:rPr>
+      </w:pPr>
+      <w:proofErr w:type="spellStart"/>
+      <w:r>
+        <w:rPr>
+          <w:b/>
+          <w:bCs/>
+          <w:color w:val="548DD4" w:themeColor="text2" w:themeTint="99"/>
+          <w:szCs w:val="22"/>
+        </w:rPr>
+        <w:t>Php</w:t>
+      </w:r>
+      <w:proofErr w:type="spellEnd"/>
+      <w:r>
+        <w:rPr>
+          <w:b/>
+          <w:bCs/>
+          <w:color w:val="548DD4" w:themeColor="text2" w:themeTint="99"/>
+          <w:szCs w:val="22"/>
+        </w:rPr>
+        <w:t xml:space="preserve"> artisan </w:t>
+      </w:r>
+      <w:proofErr w:type="spellStart"/>
+      <w:r>
+        <w:rPr>
+          <w:b/>
+          <w:bCs/>
+          <w:color w:val="548DD4" w:themeColor="text2" w:themeTint="99"/>
+          <w:szCs w:val="22"/>
+        </w:rPr>
+        <w:t>make</w:t>
+      </w:r>
+      <w:proofErr w:type="gramStart"/>
+      <w:r>
+        <w:rPr>
+          <w:b/>
+          <w:bCs/>
+          <w:color w:val="548DD4" w:themeColor="text2" w:themeTint="99"/>
+          <w:szCs w:val="22"/>
+        </w:rPr>
+        <w:t>:view</w:t>
+      </w:r>
+      <w:proofErr w:type="spellEnd"/>
+      <w:proofErr w:type="gramEnd"/>
+      <w:r>
+        <w:rPr>
+          <w:b/>
+          <w:bCs/>
+          <w:color w:val="548DD4" w:themeColor="text2" w:themeTint="99"/>
+          <w:szCs w:val="22"/>
+        </w:rPr>
+        <w:t xml:space="preserve"> </w:t>
+      </w:r>
+      <w:r>
+        <w:rPr>
+          <w:b/>
+          <w:bCs/>
+          <w:szCs w:val="22"/>
+        </w:rPr>
+        <w:t>view name (</w:t>
+      </w:r>
+      <w:r>
+        <w:rPr>
+          <w:szCs w:val="22"/>
+        </w:rPr>
+        <w:t>without .</w:t>
+      </w:r>
+      <w:proofErr w:type="spellStart"/>
+      <w:r>
+        <w:rPr>
+          <w:szCs w:val="22"/>
+        </w:rPr>
+        <w:t>blade.php</w:t>
+      </w:r>
+      <w:proofErr w:type="spellEnd"/>
+      <w:r>
+        <w:rPr>
+          <w:b/>
+          <w:bCs/>
+          <w:szCs w:val="22"/>
+        </w:rPr>
+        <w:t>)</w:t>
+      </w:r>
+    </w:p>
+    <w:p>
+      <w:pPr>
+        <w:rPr>
+          <w:b/>
+          <w:bCs/>
+          <w:szCs w:val="22"/>
+        </w:rPr>
+      </w:pPr>
+    </w:p>
+    <w:p>
+      <w:pPr>
+        <w:rPr>
+          <w:b/>
+          <w:bCs/>
+          <w:szCs w:val="22"/>
+        </w:rPr>
+      </w:pPr>
+      <w:r>
+        <w:rPr>
+          <w:b/>
+          <w:bCs/>
+          <w:szCs w:val="22"/>
+        </w:rPr>
+        <w:t>Q</w:t>
+      </w:r>
+      <w:proofErr w:type="gramStart"/>
+      <w:r>
+        <w:rPr>
+          <w:b/>
+          <w:bCs/>
+          <w:szCs w:val="22"/>
+        </w:rPr>
+        <w:t>:-</w:t>
+      </w:r>
+      <w:proofErr w:type="gramEnd"/>
+      <w:r>
+        <w:rPr>
+          <w:b/>
+          <w:bCs/>
+          <w:szCs w:val="22"/>
+        </w:rPr>
+        <w:t xml:space="preserve"> How to know view exist or not?</w:t>
+      </w:r>
+    </w:p>
+    <w:p>
+      <w:pPr>
+        <w:rPr>
+          <w:szCs w:val="22"/>
+        </w:rPr>
+      </w:pPr>
+      <w:proofErr w:type="spellStart"/>
+      <w:r>
+        <w:rPr>
+          <w:b/>
+          <w:bCs/>
+          <w:szCs w:val="22"/>
+        </w:rPr>
+        <w:t>Ans</w:t>
+      </w:r>
+      <w:proofErr w:type="spellEnd"/>
+      <w:proofErr w:type="gramStart"/>
+      <w:r>
+        <w:rPr>
+          <w:b/>
+          <w:bCs/>
+          <w:szCs w:val="22"/>
+        </w:rPr>
+        <w:t>:-</w:t>
+      </w:r>
+      <w:proofErr w:type="gramEnd"/>
+      <w:r>
+        <w:rPr>
+          <w:b/>
+          <w:bCs/>
+          <w:szCs w:val="22"/>
+        </w:rPr>
+        <w:t xml:space="preserve"> </w:t>
+      </w:r>
+      <w:r>
+        <w:rPr>
+          <w:szCs w:val="22"/>
+        </w:rPr>
+        <w:t xml:space="preserve">To check if a view file exists in </w:t>
+      </w:r>
+      <w:proofErr w:type="spellStart"/>
+      <w:r>
+        <w:rPr>
+          <w:szCs w:val="22"/>
+        </w:rPr>
+        <w:t>Laravel</w:t>
+      </w:r>
+      <w:proofErr w:type="spellEnd"/>
+      <w:r>
+        <w:rPr>
+          <w:szCs w:val="22"/>
+        </w:rPr>
+        <w:t>, you can use the View facade.</w:t>
+      </w:r>
+    </w:p>
+    <w:p>
+      <w:pPr>
+        <w:rPr>
+          <w:szCs w:val="22"/>
+        </w:rPr>
+      </w:pPr>
+      <w:r>
+        <w:rPr>
+          <w:szCs w:val="22"/>
+        </w:rPr>
+        <w:t>Import the Facade: Ensure you have the following namespace at the top of your controller or file:</w:t>
+      </w:r>
+    </w:p>
+    <w:p>
+      <w:pPr>
+        <w:rPr>
+          <w:szCs w:val="22"/>
+        </w:rPr>
+      </w:pPr>
+      <w:proofErr w:type="gramStart"/>
+      <w:r>
+        <w:rPr>
+          <w:b/>
+          <w:bCs/>
+          <w:color w:val="548DD4" w:themeColor="text2" w:themeTint="99"/>
+          <w:szCs w:val="22"/>
+        </w:rPr>
+        <w:t>use</w:t>
+      </w:r>
+      <w:proofErr w:type="gramEnd"/>
+      <w:r>
+        <w:rPr>
+          <w:b/>
+          <w:bCs/>
+          <w:color w:val="548DD4" w:themeColor="text2" w:themeTint="99"/>
+          <w:szCs w:val="22"/>
+        </w:rPr>
+        <w:t xml:space="preserve"> Illuminate\Support\Facades\View;</w:t>
+      </w:r>
+    </w:p>
+    <w:p>
+      <w:pPr>
+        <w:rPr>
+          <w:szCs w:val="22"/>
+        </w:rPr>
+      </w:pPr>
+      <w:r>
+        <w:rPr>
+          <w:szCs w:val="22"/>
+        </w:rPr>
+        <w:t xml:space="preserve">Use </w:t>
+      </w:r>
+      <w:proofErr w:type="gramStart"/>
+      <w:r>
+        <w:rPr>
+          <w:szCs w:val="22"/>
+        </w:rPr>
+        <w:t>the exists</w:t>
+      </w:r>
+      <w:proofErr w:type="gramEnd"/>
+      <w:r>
+        <w:rPr>
+          <w:szCs w:val="22"/>
+        </w:rPr>
+        <w:t xml:space="preserve"> method: You can use a simple conditional statement to verify the view's availability before attempting to load </w:t>
+      </w:r>
+      <w:proofErr w:type="spellStart"/>
+      <w:r>
+        <w:rPr>
+          <w:szCs w:val="22"/>
+        </w:rPr>
+        <w:t>it:</w:t>
+      </w:r>
+      <w:proofErr w:type="spellEnd"/>
+    </w:p>
+    <w:p>
+      <w:pPr>
+        <w:rPr>
+          <w:szCs w:val="22"/>
+        </w:rPr>
+      </w:pPr>
+      <w:proofErr w:type="spellStart"/>
+      <w:proofErr w:type="gramStart"/>
+      <w:r>
+        <w:rPr>
+          <w:szCs w:val="22"/>
+        </w:rPr>
+        <w:t>php</w:t>
+      </w:r>
+      <w:proofErr w:type="spellEnd"/>
+      <w:proofErr w:type="gramEnd"/>
+    </w:p>
+    <w:p>
+      <w:pPr>
+        <w:rPr>
+          <w:color w:val="548DD4" w:themeColor="text2" w:themeTint="99"/>
+          <w:szCs w:val="22"/>
+        </w:rPr>
+      </w:pPr>
+      <w:proofErr w:type="gramStart"/>
+      <w:r>
+        <w:rPr>
+          <w:color w:val="548DD4" w:themeColor="text2" w:themeTint="99"/>
+          <w:szCs w:val="22"/>
+        </w:rPr>
+        <w:t>if</w:t>
+      </w:r>
+      <w:proofErr w:type="gramEnd"/>
+      <w:r>
+        <w:rPr>
+          <w:color w:val="548DD4" w:themeColor="text2" w:themeTint="99"/>
+          <w:szCs w:val="22"/>
+        </w:rPr>
+        <w:t xml:space="preserve"> (View::exists('</w:t>
+      </w:r>
+      <w:proofErr w:type="spellStart"/>
+      <w:r>
+        <w:rPr>
+          <w:color w:val="548DD4" w:themeColor="text2" w:themeTint="99"/>
+          <w:szCs w:val="22"/>
+        </w:rPr>
+        <w:t>admin.login</w:t>
+      </w:r>
+      <w:proofErr w:type="spellEnd"/>
+      <w:r>
+        <w:rPr>
+          <w:color w:val="548DD4" w:themeColor="text2" w:themeTint="99"/>
+          <w:szCs w:val="22"/>
+        </w:rPr>
+        <w:t>')) {</w:t>
+      </w:r>
+    </w:p>
+    <w:p>
+      <w:pPr>
+        <w:rPr>
+          <w:color w:val="548DD4" w:themeColor="text2" w:themeTint="99"/>
+          <w:szCs w:val="22"/>
+        </w:rPr>
+      </w:pPr>
+      <w:proofErr w:type="gramStart"/>
+      <w:r>
+        <w:rPr>
+          <w:color w:val="548DD4" w:themeColor="text2" w:themeTint="99"/>
+          <w:szCs w:val="22"/>
+        </w:rPr>
+        <w:t>return</w:t>
+      </w:r>
+      <w:proofErr w:type="gramEnd"/>
+      <w:r>
+        <w:rPr>
+          <w:color w:val="548DD4" w:themeColor="text2" w:themeTint="99"/>
+          <w:szCs w:val="22"/>
+        </w:rPr>
+        <w:t xml:space="preserve"> view('</w:t>
+      </w:r>
+      <w:proofErr w:type="spellStart"/>
+      <w:r>
+        <w:rPr>
+          <w:color w:val="548DD4" w:themeColor="text2" w:themeTint="99"/>
+          <w:szCs w:val="22"/>
+        </w:rPr>
+        <w:t>admin.login</w:t>
+      </w:r>
+      <w:proofErr w:type="spellEnd"/>
+      <w:r>
+        <w:rPr>
+          <w:color w:val="548DD4" w:themeColor="text2" w:themeTint="99"/>
+          <w:szCs w:val="22"/>
+        </w:rPr>
+        <w:t>');</w:t>
+      </w:r>
+    </w:p>
+    <w:p>
+      <w:pPr>
+        <w:rPr>
+          <w:color w:val="548DD4" w:themeColor="text2" w:themeTint="99"/>
+          <w:szCs w:val="22"/>
+        </w:rPr>
+      </w:pPr>
+      <w:r>
+        <w:rPr>
+          <w:color w:val="548DD4" w:themeColor="text2" w:themeTint="99"/>
+          <w:szCs w:val="22"/>
+        </w:rPr>
+        <w:t>} else {</w:t>
+      </w:r>
+    </w:p>
+    <w:p>
+      <w:pPr>
+        <w:rPr>
+          <w:color w:val="548DD4" w:themeColor="text2" w:themeTint="99"/>
+          <w:szCs w:val="22"/>
+        </w:rPr>
+      </w:pPr>
+      <w:proofErr w:type="gramStart"/>
+      <w:r>
+        <w:rPr>
+          <w:color w:val="548DD4" w:themeColor="text2" w:themeTint="99"/>
+          <w:szCs w:val="22"/>
+        </w:rPr>
+        <w:t>return</w:t>
+      </w:r>
+      <w:proofErr w:type="gramEnd"/>
+      <w:r>
+        <w:rPr>
+          <w:color w:val="548DD4" w:themeColor="text2" w:themeTint="99"/>
+          <w:szCs w:val="22"/>
+        </w:rPr>
+        <w:t xml:space="preserve"> "No view found";</w:t>
+      </w:r>
+    </w:p>
+    <w:p>
+      <w:pPr>
+        <w:rPr>
+          <w:color w:val="548DD4" w:themeColor="text2" w:themeTint="99"/>
+          <w:szCs w:val="22"/>
+        </w:rPr>
+      </w:pPr>
       <w:bookmarkStart w:id="0" w:name="_GoBack"/>
       <w:bookmarkEnd w:id="0"/>
+      <w:r>
+        <w:rPr>
+          <w:color w:val="548DD4" w:themeColor="text2" w:themeTint="99"/>
+          <w:szCs w:val="22"/>
+        </w:rPr>
+        <w:t>}</w:t>
+      </w:r>
     </w:p>
     <w:sectPr>
       <w:pgSz w:w="11906" w:h="16838"/>

</xml_diff>

<commit_message>
Add Laravel notes and Practice files:Blade Template
</commit_message>
<xml_diff>
--- a/Laravel-Learning/Laravel notes.docx
+++ b/Laravel-Learning/Laravel notes.docx
@@ -3719,16 +3719,8 @@
         <w:rPr>
           <w:szCs w:val="22"/>
         </w:rPr>
-        <w:t xml:space="preserve"> method: You can use a simple conditional statement to verify the view's availability before attempting to load </w:t>
-      </w:r>
-      <w:proofErr w:type="spellStart"/>
-      <w:r>
-        <w:rPr>
-          <w:szCs w:val="22"/>
-        </w:rPr>
-        <w:t>it:</w:t>
-      </w:r>
-      <w:proofErr w:type="spellEnd"/>
+        <w:t xml:space="preserve"> method: You can use a simple conditional statement to verify the view's availability before attempting to load it:</w:t>
+      </w:r>
     </w:p>
     <w:p>
       <w:pPr>
@@ -3870,18 +3862,466 @@
       <w:pPr>
         <w:rPr>
           <w:color w:val="548DD4" w:themeColor="text2" w:themeTint="99"/>
+          <w:szCs w:val="22"/>
+        </w:rPr>
+      </w:pPr>
+      <w:r>
+        <w:rPr>
+          <w:color w:val="548DD4" w:themeColor="text2" w:themeTint="99"/>
+          <w:szCs w:val="22"/>
+        </w:rPr>
+        <w:t>}</w:t>
+      </w:r>
+    </w:p>
+    <w:p>
+      <w:pPr>
+        <w:rPr>
+          <w:color w:val="548DD4" w:themeColor="text2" w:themeTint="99"/>
+          <w:szCs w:val="22"/>
+        </w:rPr>
+      </w:pPr>
+    </w:p>
+    <w:p>
+      <w:pPr>
+        <w:rPr>
+          <w:b/>
+          <w:bCs/>
+          <w:color w:val="FF0000"/>
+          <w:sz w:val="40"/>
+          <w:szCs w:val="40"/>
+          <w:u w:val="single"/>
+        </w:rPr>
+      </w:pPr>
+      <w:r>
+        <w:rPr>
+          <w:b/>
+          <w:bCs/>
+          <w:color w:val="FF0000"/>
+          <w:sz w:val="40"/>
+          <w:szCs w:val="40"/>
+          <w:u w:val="single"/>
+        </w:rPr>
+        <w:t>Blade template:</w:t>
+      </w:r>
+    </w:p>
+    <w:p>
+      <w:pPr>
+        <w:rPr>
+          <w:b/>
+          <w:bCs/>
+          <w:szCs w:val="22"/>
+          <w:u w:val="single"/>
+        </w:rPr>
+      </w:pPr>
+      <w:r>
+        <w:rPr>
+          <w:b/>
+          <w:bCs/>
+          <w:szCs w:val="22"/>
+          <w:u w:val="single"/>
+        </w:rPr>
+        <w:t>Q</w:t>
+      </w:r>
+      <w:proofErr w:type="gramStart"/>
+      <w:r>
+        <w:rPr>
+          <w:b/>
+          <w:bCs/>
+          <w:szCs w:val="22"/>
+          <w:u w:val="single"/>
+        </w:rPr>
+        <w:t>:-</w:t>
+      </w:r>
+      <w:proofErr w:type="gramEnd"/>
+      <w:r>
+        <w:rPr>
+          <w:b/>
+          <w:bCs/>
+          <w:szCs w:val="22"/>
+          <w:u w:val="single"/>
+        </w:rPr>
+        <w:t xml:space="preserve"> Why to use blade template?</w:t>
+      </w:r>
+    </w:p>
+    <w:p>
+      <w:pPr>
+        <w:rPr>
+          <w:b/>
+          <w:bCs/>
+          <w:szCs w:val="22"/>
+          <w:u w:val="single"/>
+        </w:rPr>
+      </w:pPr>
+      <w:proofErr w:type="spellStart"/>
+      <w:r>
+        <w:rPr>
+          <w:b/>
+          <w:bCs/>
+          <w:szCs w:val="22"/>
+          <w:u w:val="single"/>
+        </w:rPr>
+        <w:t>Ans</w:t>
+      </w:r>
+      <w:proofErr w:type="spellEnd"/>
+      <w:r>
+        <w:rPr>
+          <w:b/>
+          <w:bCs/>
+          <w:szCs w:val="22"/>
+          <w:u w:val="single"/>
+        </w:rPr>
+        <w:t xml:space="preserve">:- </w:t>
+      </w:r>
+    </w:p>
+    <w:p>
+      <w:pPr>
+        <w:rPr>
+          <w:b/>
+          <w:bCs/>
+          <w:szCs w:val="22"/>
+        </w:rPr>
+      </w:pPr>
+      <w:r>
+        <w:rPr>
+          <w:b/>
+          <w:bCs/>
+          <w:szCs w:val="22"/>
+        </w:rPr>
+        <w:t>1. Cleaner and More Readable Code</w:t>
+      </w:r>
+    </w:p>
+    <w:p>
+      <w:pPr>
+        <w:rPr>
+          <w:szCs w:val="22"/>
+        </w:rPr>
+      </w:pPr>
+      <w:r>
+        <w:rPr>
+          <w:szCs w:val="22"/>
+        </w:rPr>
+        <w:tab/>
+      </w:r>
+      <w:r>
+        <w:rPr>
+          <w:szCs w:val="22"/>
+        </w:rPr>
+        <w:t xml:space="preserve">Plain PHP: </w:t>
+      </w:r>
+      <w:r>
+        <w:rPr>
+          <w:color w:val="548DD4" w:themeColor="text2" w:themeTint="99"/>
+          <w:szCs w:val="22"/>
+        </w:rPr>
+        <w:t>&lt;</w:t>
+      </w:r>
+      <w:proofErr w:type="gramStart"/>
+      <w:r>
+        <w:rPr>
+          <w:color w:val="548DD4" w:themeColor="text2" w:themeTint="99"/>
+          <w:szCs w:val="22"/>
+        </w:rPr>
+        <w:t>?</w:t>
+      </w:r>
+      <w:proofErr w:type="spellStart"/>
+      <w:r>
+        <w:rPr>
+          <w:color w:val="548DD4" w:themeColor="text2" w:themeTint="99"/>
+          <w:szCs w:val="22"/>
+        </w:rPr>
+        <w:t>php</w:t>
+      </w:r>
+      <w:proofErr w:type="spellEnd"/>
+      <w:proofErr w:type="gramEnd"/>
+      <w:r>
+        <w:rPr>
+          <w:color w:val="548DD4" w:themeColor="text2" w:themeTint="99"/>
+          <w:szCs w:val="22"/>
+        </w:rPr>
+        <w:t xml:space="preserve"> if($user-&gt;</w:t>
+      </w:r>
+      <w:proofErr w:type="spellStart"/>
+      <w:r>
+        <w:rPr>
+          <w:color w:val="548DD4" w:themeColor="text2" w:themeTint="99"/>
+          <w:szCs w:val="22"/>
+        </w:rPr>
+        <w:t>isAdmin</w:t>
+      </w:r>
+      <w:proofErr w:type="spellEnd"/>
+      <w:r>
+        <w:rPr>
+          <w:color w:val="548DD4" w:themeColor="text2" w:themeTint="99"/>
+          <w:szCs w:val="22"/>
+        </w:rPr>
+        <w:t>): ?&gt; ... &lt;?</w:t>
+      </w:r>
+      <w:proofErr w:type="spellStart"/>
+      <w:r>
+        <w:rPr>
+          <w:color w:val="548DD4" w:themeColor="text2" w:themeTint="99"/>
+          <w:szCs w:val="22"/>
+        </w:rPr>
+        <w:t>php</w:t>
+      </w:r>
+      <w:proofErr w:type="spellEnd"/>
+      <w:r>
+        <w:rPr>
+          <w:color w:val="548DD4" w:themeColor="text2" w:themeTint="99"/>
+          <w:szCs w:val="22"/>
+        </w:rPr>
+        <w:t xml:space="preserve"> </w:t>
+      </w:r>
+      <w:proofErr w:type="spellStart"/>
+      <w:r>
+        <w:rPr>
+          <w:color w:val="548DD4" w:themeColor="text2" w:themeTint="99"/>
+          <w:szCs w:val="22"/>
+        </w:rPr>
+        <w:t>endif</w:t>
+      </w:r>
+      <w:proofErr w:type="spellEnd"/>
+      <w:r>
+        <w:rPr>
+          <w:color w:val="548DD4" w:themeColor="text2" w:themeTint="99"/>
+          <w:szCs w:val="22"/>
+        </w:rPr>
+        <w:t>; ?&gt;</w:t>
+      </w:r>
+    </w:p>
+    <w:p>
+      <w:pPr>
+        <w:ind w:firstLine="720"/>
+        <w:rPr>
+          <w:color w:val="548DD4" w:themeColor="text2" w:themeTint="99"/>
+          <w:szCs w:val="22"/>
+        </w:rPr>
+      </w:pPr>
+      <w:r>
+        <w:rPr>
+          <w:szCs w:val="22"/>
+        </w:rPr>
+        <w:t xml:space="preserve">Blade: </w:t>
+      </w:r>
+      <w:proofErr w:type="gramStart"/>
+      <w:r>
+        <w:rPr>
+          <w:color w:val="548DD4" w:themeColor="text2" w:themeTint="99"/>
+          <w:szCs w:val="22"/>
+        </w:rPr>
+        <w:t>@if(</w:t>
+      </w:r>
+      <w:proofErr w:type="gramEnd"/>
+      <w:r>
+        <w:rPr>
+          <w:color w:val="548DD4" w:themeColor="text2" w:themeTint="99"/>
+          <w:szCs w:val="22"/>
+        </w:rPr>
+        <w:t>$user-&gt;</w:t>
+      </w:r>
+      <w:proofErr w:type="spellStart"/>
+      <w:r>
+        <w:rPr>
+          <w:color w:val="548DD4" w:themeColor="text2" w:themeTint="99"/>
+          <w:szCs w:val="22"/>
+        </w:rPr>
+        <w:t>isAdmin</w:t>
+      </w:r>
+      <w:proofErr w:type="spellEnd"/>
+      <w:r>
+        <w:rPr>
+          <w:color w:val="548DD4" w:themeColor="text2" w:themeTint="99"/>
+          <w:szCs w:val="22"/>
+        </w:rPr>
+        <w:t>) ... @</w:t>
+      </w:r>
+      <w:proofErr w:type="spellStart"/>
+      <w:r>
+        <w:rPr>
+          <w:color w:val="548DD4" w:themeColor="text2" w:themeTint="99"/>
+          <w:szCs w:val="22"/>
+        </w:rPr>
+        <w:t>endif</w:t>
+      </w:r>
+      <w:proofErr w:type="spellEnd"/>
+    </w:p>
+    <w:p>
+      <w:pPr>
+        <w:rPr>
+          <w:szCs w:val="22"/>
+        </w:rPr>
+      </w:pPr>
+    </w:p>
+    <w:p>
+      <w:pPr>
+        <w:rPr>
+          <w:b/>
+          <w:bCs/>
+        </w:rPr>
+      </w:pPr>
+      <w:r>
+        <w:rPr>
+          <w:b/>
+          <w:bCs/>
+          <w:szCs w:val="22"/>
+        </w:rPr>
+        <w:t xml:space="preserve">2. </w:t>
+      </w:r>
+      <w:r>
+        <w:rPr>
+          <w:b/>
+          <w:bCs/>
+        </w:rPr>
+        <w:t>High Performance</w:t>
+      </w:r>
+    </w:p>
+    <w:p>
+      <w:pPr>
+        <w:ind w:left="720"/>
+      </w:pPr>
+      <w:r>
+        <w:t xml:space="preserve">Even though Blade uses a custom syntax, it doesn't slow down your website. </w:t>
+      </w:r>
+      <w:proofErr w:type="spellStart"/>
+      <w:r>
+        <w:t>Laravel</w:t>
+      </w:r>
+      <w:proofErr w:type="spellEnd"/>
+      <w:r>
+        <w:t xml:space="preserve"> compiles your Blade templates into optimized PHP code and caches them.</w:t>
+      </w:r>
+      <w:r>
+        <w:t xml:space="preserve"> This makes it faster</w:t>
+      </w:r>
+    </w:p>
+    <w:p/>
+    <w:p>
+      <w:r>
+        <w:lastRenderedPageBreak/>
+        <w:t xml:space="preserve">3. </w:t>
+      </w:r>
+      <w:r>
+        <w:rPr>
+          <w:b/>
+          <w:bCs/>
+        </w:rPr>
+        <w:t>Reusable Components</w:t>
+      </w:r>
+    </w:p>
+    <w:p>
+      <w:pPr>
+        <w:ind w:left="720"/>
+      </w:pPr>
+      <w:r>
+        <w:t>You can create small, reusable UI elements like buttons, alerts, or modals as Blade Components. Once defined, you can use them anywhere in your app with a simple tag like &lt;x-button /&gt;</w:t>
+      </w:r>
+    </w:p>
+    <w:p>
+      <w:pPr>
+        <w:rPr>
+          <w:b/>
+          <w:bCs/>
+        </w:rPr>
+      </w:pPr>
+      <w:r>
+        <w:t xml:space="preserve">4. </w:t>
+      </w:r>
+      <w:r>
+        <w:rPr>
+          <w:b/>
+          <w:bCs/>
+        </w:rPr>
+        <w:t>Built-in Security</w:t>
+      </w:r>
+    </w:p>
+    <w:p>
+      <w:pPr>
+        <w:ind w:left="720"/>
+      </w:pPr>
+      <w:r>
+        <w:t xml:space="preserve">Security is a top priority in </w:t>
+      </w:r>
+      <w:proofErr w:type="spellStart"/>
+      <w:r>
+        <w:t>Laravel</w:t>
+      </w:r>
+      <w:proofErr w:type="spellEnd"/>
+      <w:r>
+        <w:t>. Blade automatically protects your application from Cross-Site Scripting (XSS) attacks. When you use {</w:t>
+      </w:r>
+      <w:proofErr w:type="gramStart"/>
+      <w:r>
+        <w:t>{ $</w:t>
+      </w:r>
+      <w:proofErr w:type="gramEnd"/>
+      <w:r>
+        <w:t>variable }}, Blade automatically escapes any dangerous HTML characters before displaying them.</w:t>
+      </w:r>
+    </w:p>
+    <w:p/>
+    <w:p>
+      <w:pPr>
+        <w:rPr>
+          <w:szCs w:val="22"/>
+        </w:rPr>
+      </w:pPr>
+      <w:r>
+        <w:rPr>
+          <w:noProof/>
+          <w:lang w:eastAsia="en-IN"/>
+        </w:rPr>
+        <w:drawing>
+          <wp:inline distT="0" distB="0" distL="0" distR="0" wp14:anchorId="0BC2693D" wp14:editId="111F85AC">
+            <wp:extent cx="3830697" cy="2154767"/>
+            <wp:effectExtent l="0" t="0" r="0" b="0"/>
+            <wp:docPr id="7" name="Picture 7"/>
+            <wp:cNvGraphicFramePr>
+              <a:graphicFrameLocks xmlns:a="http://schemas.openxmlformats.org/drawingml/2006/main" noChangeAspect="1"/>
+            </wp:cNvGraphicFramePr>
+            <a:graphic xmlns:a="http://schemas.openxmlformats.org/drawingml/2006/main">
+              <a:graphicData uri="http://schemas.openxmlformats.org/drawingml/2006/picture">
+                <pic:pic xmlns:pic="http://schemas.openxmlformats.org/drawingml/2006/picture">
+                  <pic:nvPicPr>
+                    <pic:cNvPr id="0" name=""/>
+                    <pic:cNvPicPr/>
+                  </pic:nvPicPr>
+                  <pic:blipFill>
+                    <a:blip r:embed="rId14"/>
+                    <a:stretch>
+                      <a:fillRect/>
+                    </a:stretch>
+                  </pic:blipFill>
+                  <pic:spPr>
+                    <a:xfrm>
+                      <a:off x="0" y="0"/>
+                      <a:ext cx="3830414" cy="2154608"/>
+                    </a:xfrm>
+                    <a:prstGeom prst="rect">
+                      <a:avLst/>
+                    </a:prstGeom>
+                  </pic:spPr>
+                </pic:pic>
+              </a:graphicData>
+            </a:graphic>
+          </wp:inline>
+        </w:drawing>
+      </w:r>
+    </w:p>
+    <w:p>
+      <w:pPr>
+        <w:rPr>
+          <w:szCs w:val="22"/>
+        </w:rPr>
+      </w:pPr>
+    </w:p>
+    <w:p>
+      <w:pPr>
+        <w:rPr>
           <w:szCs w:val="22"/>
         </w:rPr>
       </w:pPr>
       <w:bookmarkStart w:id="0" w:name="_GoBack"/>
       <w:bookmarkEnd w:id="0"/>
-      <w:r>
-        <w:rPr>
-          <w:color w:val="548DD4" w:themeColor="text2" w:themeTint="99"/>
-          <w:szCs w:val="22"/>
-        </w:rPr>
-        <w:t>}</w:t>
-      </w:r>
     </w:p>
     <w:sectPr>
       <w:pgSz w:w="11906" w:h="16838"/>
@@ -4059,6 +4499,92 @@
     </w:lvl>
   </w:abstractNum>
   <w:abstractNum w:abstractNumId="1">
+    <w:nsid w:val="30317697"/>
+    <w:multiLevelType w:val="hybridMultilevel"/>
+    <w:tmpl w:val="B03EB28C"/>
+    <w:lvl w:ilvl="0" w:tplc="4009000F">
+      <w:start w:val="1"/>
+      <w:numFmt w:val="decimal"/>
+      <w:lvlText w:val="%1."/>
+      <w:lvlJc w:val="left"/>
+      <w:pPr>
+        <w:ind w:left="720" w:hanging="360"/>
+      </w:pPr>
+    </w:lvl>
+    <w:lvl w:ilvl="1" w:tplc="40090019" w:tentative="1">
+      <w:start w:val="1"/>
+      <w:numFmt w:val="lowerLetter"/>
+      <w:lvlText w:val="%2."/>
+      <w:lvlJc w:val="left"/>
+      <w:pPr>
+        <w:ind w:left="1440" w:hanging="360"/>
+      </w:pPr>
+    </w:lvl>
+    <w:lvl w:ilvl="2" w:tplc="4009001B" w:tentative="1">
+      <w:start w:val="1"/>
+      <w:numFmt w:val="lowerRoman"/>
+      <w:lvlText w:val="%3."/>
+      <w:lvlJc w:val="right"/>
+      <w:pPr>
+        <w:ind w:left="2160" w:hanging="180"/>
+      </w:pPr>
+    </w:lvl>
+    <w:lvl w:ilvl="3" w:tplc="4009000F" w:tentative="1">
+      <w:start w:val="1"/>
+      <w:numFmt w:val="decimal"/>
+      <w:lvlText w:val="%4."/>
+      <w:lvlJc w:val="left"/>
+      <w:pPr>
+        <w:ind w:left="2880" w:hanging="360"/>
+      </w:pPr>
+    </w:lvl>
+    <w:lvl w:ilvl="4" w:tplc="40090019" w:tentative="1">
+      <w:start w:val="1"/>
+      <w:numFmt w:val="lowerLetter"/>
+      <w:lvlText w:val="%5."/>
+      <w:lvlJc w:val="left"/>
+      <w:pPr>
+        <w:ind w:left="3600" w:hanging="360"/>
+      </w:pPr>
+    </w:lvl>
+    <w:lvl w:ilvl="5" w:tplc="4009001B" w:tentative="1">
+      <w:start w:val="1"/>
+      <w:numFmt w:val="lowerRoman"/>
+      <w:lvlText w:val="%6."/>
+      <w:lvlJc w:val="right"/>
+      <w:pPr>
+        <w:ind w:left="4320" w:hanging="180"/>
+      </w:pPr>
+    </w:lvl>
+    <w:lvl w:ilvl="6" w:tplc="4009000F" w:tentative="1">
+      <w:start w:val="1"/>
+      <w:numFmt w:val="decimal"/>
+      <w:lvlText w:val="%7."/>
+      <w:lvlJc w:val="left"/>
+      <w:pPr>
+        <w:ind w:left="5040" w:hanging="360"/>
+      </w:pPr>
+    </w:lvl>
+    <w:lvl w:ilvl="7" w:tplc="40090019" w:tentative="1">
+      <w:start w:val="1"/>
+      <w:numFmt w:val="lowerLetter"/>
+      <w:lvlText w:val="%8."/>
+      <w:lvlJc w:val="left"/>
+      <w:pPr>
+        <w:ind w:left="5760" w:hanging="360"/>
+      </w:pPr>
+    </w:lvl>
+    <w:lvl w:ilvl="8" w:tplc="4009001B" w:tentative="1">
+      <w:start w:val="1"/>
+      <w:numFmt w:val="lowerRoman"/>
+      <w:lvlText w:val="%9."/>
+      <w:lvlJc w:val="right"/>
+      <w:pPr>
+        <w:ind w:left="6480" w:hanging="180"/>
+      </w:pPr>
+    </w:lvl>
+  </w:abstractNum>
+  <w:abstractNum w:abstractNumId="2">
     <w:nsid w:val="387058FD"/>
     <w:multiLevelType w:val="hybridMultilevel"/>
     <w:tmpl w:val="BB100E0E"/>
@@ -4171,7 +4697,7 @@
       </w:rPr>
     </w:lvl>
   </w:abstractNum>
-  <w:abstractNum w:abstractNumId="2">
+  <w:abstractNum w:abstractNumId="3">
     <w:nsid w:val="769E6830"/>
     <w:multiLevelType w:val="hybridMultilevel"/>
     <w:tmpl w:val="9196B5D2"/>
@@ -4285,13 +4811,16 @@
     </w:lvl>
   </w:abstractNum>
   <w:num w:numId="1">
-    <w:abstractNumId w:val="1"/>
+    <w:abstractNumId w:val="2"/>
   </w:num>
   <w:num w:numId="2">
-    <w:abstractNumId w:val="2"/>
+    <w:abstractNumId w:val="3"/>
   </w:num>
   <w:num w:numId="3">
     <w:abstractNumId w:val="0"/>
+  </w:num>
+  <w:num w:numId="4">
+    <w:abstractNumId w:val="1"/>
   </w:num>
 </w:numbering>
 </file>

</xml_diff>

<commit_message>
Add Laravel notes, practice files, and project setup
</commit_message>
<xml_diff>
--- a/Laravel-Learning/Laravel notes.docx
+++ b/Laravel-Learning/Laravel notes.docx
@@ -4317,11 +4317,945 @@
     <w:p>
       <w:pPr>
         <w:rPr>
-          <w:szCs w:val="22"/>
-        </w:rPr>
-      </w:pPr>
+          <w:b/>
+          <w:bCs/>
+          <w:color w:val="FF0000"/>
+          <w:sz w:val="40"/>
+          <w:szCs w:val="40"/>
+          <w:u w:val="single"/>
+        </w:rPr>
+      </w:pPr>
+      <w:r>
+        <w:rPr>
+          <w:b/>
+          <w:bCs/>
+          <w:color w:val="FF0000"/>
+          <w:sz w:val="40"/>
+          <w:szCs w:val="40"/>
+          <w:u w:val="single"/>
+        </w:rPr>
+        <w:t>Sub view:</w:t>
+      </w:r>
+    </w:p>
+    <w:p>
+      <w:pPr>
+        <w:spacing w:line="240" w:lineRule="auto"/>
+        <w:rPr>
+          <w:rFonts w:eastAsia="Times New Roman" w:cstheme="minorHAnsi"/>
+          <w:color w:val="FF0000"/>
+          <w:sz w:val="24"/>
+          <w:szCs w:val="24"/>
+          <w:lang w:eastAsia="en-IN"/>
+        </w:rPr>
+      </w:pPr>
+      <w:r>
+        <w:rPr>
+          <w:rFonts w:eastAsia="Times New Roman" w:cstheme="minorHAnsi"/>
+          <w:color w:val="FF0000"/>
+          <w:sz w:val="24"/>
+          <w:szCs w:val="24"/>
+          <w:lang w:eastAsia="en-IN"/>
+        </w:rPr>
+        <w:t xml:space="preserve">In </w:t>
+      </w:r>
+      <w:proofErr w:type="spellStart"/>
+      <w:r>
+        <w:rPr>
+          <w:rFonts w:eastAsia="Times New Roman" w:cstheme="minorHAnsi"/>
+          <w:color w:val="FF0000"/>
+          <w:sz w:val="24"/>
+          <w:szCs w:val="24"/>
+          <w:lang w:eastAsia="en-IN"/>
+        </w:rPr>
+        <w:t>Laravel</w:t>
+      </w:r>
+      <w:proofErr w:type="spellEnd"/>
+      <w:r>
+        <w:rPr>
+          <w:rFonts w:eastAsia="Times New Roman" w:cstheme="minorHAnsi"/>
+          <w:color w:val="FF0000"/>
+          <w:sz w:val="24"/>
+          <w:szCs w:val="24"/>
+          <w:lang w:eastAsia="en-IN"/>
+        </w:rPr>
+        <w:t xml:space="preserve">, a </w:t>
+      </w:r>
+      <w:proofErr w:type="spellStart"/>
+      <w:r>
+        <w:rPr>
+          <w:rFonts w:eastAsia="Times New Roman" w:cstheme="minorHAnsi"/>
+          <w:b/>
+          <w:bCs/>
+          <w:color w:val="FF0000"/>
+          <w:sz w:val="24"/>
+          <w:szCs w:val="24"/>
+          <w:lang w:eastAsia="en-IN"/>
+        </w:rPr>
+        <w:t>subview</w:t>
+      </w:r>
+      <w:proofErr w:type="spellEnd"/>
+      <w:r>
+        <w:rPr>
+          <w:rFonts w:eastAsia="Times New Roman" w:cstheme="minorHAnsi"/>
+          <w:color w:val="FF0000"/>
+          <w:sz w:val="24"/>
+          <w:szCs w:val="24"/>
+          <w:lang w:eastAsia="en-IN"/>
+        </w:rPr>
+        <w:t xml:space="preserve"> is a smaller, reusable Blade file that is included inside a larger "parent" view. </w:t>
+      </w:r>
+    </w:p>
+    <w:p>
+      <w:pPr>
+        <w:spacing w:line="240" w:lineRule="auto"/>
+        <w:rPr>
+          <w:rFonts w:eastAsia="Times New Roman" w:cstheme="minorHAnsi"/>
+          <w:sz w:val="24"/>
+          <w:szCs w:val="24"/>
+          <w:lang w:eastAsia="en-IN"/>
+        </w:rPr>
+      </w:pPr>
+      <w:r>
+        <w:rPr>
+          <w:rFonts w:eastAsia="Times New Roman" w:cstheme="minorHAnsi"/>
+          <w:sz w:val="24"/>
+          <w:szCs w:val="24"/>
+          <w:lang w:eastAsia="en-IN"/>
+        </w:rPr>
+        <w:t>It allows you to modularize your UI by breaking down complex layouts into manageable snippets, such as headers, footers, or reusable form inputs.</w:t>
+      </w:r>
+    </w:p>
+    <w:p>
+      <w:pPr>
+        <w:spacing w:after="180" w:line="240" w:lineRule="auto"/>
+        <w:rPr>
+          <w:rFonts w:eastAsia="Times New Roman" w:cstheme="minorHAnsi"/>
+          <w:b/>
+          <w:bCs/>
+          <w:sz w:val="30"/>
+          <w:szCs w:val="30"/>
+          <w:lang w:eastAsia="en-IN"/>
+        </w:rPr>
+      </w:pPr>
+      <w:r>
+        <w:rPr>
+          <w:rFonts w:eastAsia="Times New Roman" w:cstheme="minorHAnsi"/>
+          <w:b/>
+          <w:bCs/>
+          <w:sz w:val="30"/>
+          <w:szCs w:val="30"/>
+          <w:lang w:eastAsia="en-IN"/>
+        </w:rPr>
+        <w:t>Key Concepts</w:t>
+      </w:r>
+    </w:p>
+    <w:p>
+      <w:pPr>
+        <w:pStyle w:val="ListParagraph"/>
+        <w:numPr>
+          <w:ilvl w:val="0"/>
+          <w:numId w:val="3"/>
+        </w:numPr>
+        <w:spacing w:after="0" w:line="240" w:lineRule="auto"/>
+        <w:rPr>
+          <w:rFonts w:eastAsia="Times New Roman" w:cstheme="minorHAnsi"/>
+          <w:sz w:val="24"/>
+          <w:szCs w:val="24"/>
+          <w:lang w:eastAsia="en-IN"/>
+        </w:rPr>
+      </w:pPr>
+      <w:r>
+        <w:rPr>
+          <w:rFonts w:eastAsia="Times New Roman" w:cstheme="minorHAnsi"/>
+          <w:b/>
+          <w:bCs/>
+          <w:sz w:val="24"/>
+          <w:szCs w:val="24"/>
+          <w:lang w:eastAsia="en-IN"/>
+        </w:rPr>
+        <w:t>Reusability</w:t>
+      </w:r>
+      <w:r>
+        <w:rPr>
+          <w:rFonts w:eastAsia="Times New Roman" w:cstheme="minorHAnsi"/>
+          <w:sz w:val="24"/>
+          <w:szCs w:val="24"/>
+          <w:lang w:eastAsia="en-IN"/>
+        </w:rPr>
+        <w:t>: You can create a component once (e.g., a navigation bar) and include it on multiple pages without duplicating code.</w:t>
+      </w:r>
+    </w:p>
+    <w:p>
+      <w:pPr>
+        <w:pStyle w:val="ListParagraph"/>
+        <w:numPr>
+          <w:ilvl w:val="0"/>
+          <w:numId w:val="3"/>
+        </w:numPr>
+        <w:spacing w:after="0" w:line="240" w:lineRule="auto"/>
+        <w:rPr>
+          <w:rFonts w:eastAsia="Times New Roman" w:cstheme="minorHAnsi"/>
+          <w:sz w:val="24"/>
+          <w:szCs w:val="24"/>
+          <w:lang w:eastAsia="en-IN"/>
+        </w:rPr>
+      </w:pPr>
+      <w:r>
+        <w:rPr>
+          <w:rFonts w:eastAsia="Times New Roman" w:cstheme="minorHAnsi"/>
+          <w:b/>
+          <w:bCs/>
+          <w:sz w:val="24"/>
+          <w:szCs w:val="24"/>
+          <w:lang w:eastAsia="en-IN"/>
+        </w:rPr>
+        <w:t>Organization</w:t>
+      </w:r>
+      <w:r>
+        <w:rPr>
+          <w:rFonts w:eastAsia="Times New Roman" w:cstheme="minorHAnsi"/>
+          <w:sz w:val="24"/>
+          <w:szCs w:val="24"/>
+          <w:lang w:eastAsia="en-IN"/>
+        </w:rPr>
+        <w:t xml:space="preserve">: Moving large blocks of HTML into separate </w:t>
+      </w:r>
+      <w:proofErr w:type="spellStart"/>
+      <w:r>
+        <w:rPr>
+          <w:rFonts w:eastAsia="Times New Roman" w:cstheme="minorHAnsi"/>
+          <w:sz w:val="24"/>
+          <w:szCs w:val="24"/>
+          <w:lang w:eastAsia="en-IN"/>
+        </w:rPr>
+        <w:t>subview</w:t>
+      </w:r>
+      <w:proofErr w:type="spellEnd"/>
+      <w:r>
+        <w:rPr>
+          <w:rFonts w:eastAsia="Times New Roman" w:cstheme="minorHAnsi"/>
+          <w:sz w:val="24"/>
+          <w:szCs w:val="24"/>
+          <w:lang w:eastAsia="en-IN"/>
+        </w:rPr>
+        <w:t xml:space="preserve"> files keeps your main templates clean and easier to maintain.</w:t>
+      </w:r>
+    </w:p>
+    <w:p>
+      <w:pPr>
+        <w:pStyle w:val="ListParagraph"/>
+        <w:numPr>
+          <w:ilvl w:val="0"/>
+          <w:numId w:val="3"/>
+        </w:numPr>
+        <w:spacing w:after="0" w:line="240" w:lineRule="auto"/>
+        <w:rPr>
+          <w:rFonts w:eastAsia="Times New Roman" w:cstheme="minorHAnsi"/>
+          <w:sz w:val="24"/>
+          <w:szCs w:val="24"/>
+          <w:lang w:eastAsia="en-IN"/>
+        </w:rPr>
+      </w:pPr>
+      <w:r>
+        <w:rPr>
+          <w:rFonts w:eastAsia="Times New Roman" w:cstheme="minorHAnsi"/>
+          <w:b/>
+          <w:bCs/>
+          <w:sz w:val="24"/>
+          <w:szCs w:val="24"/>
+          <w:lang w:eastAsia="en-IN"/>
+        </w:rPr>
+        <w:t>Data Inheritance</w:t>
+      </w:r>
+      <w:r>
+        <w:rPr>
+          <w:rFonts w:eastAsia="Times New Roman" w:cstheme="minorHAnsi"/>
+          <w:sz w:val="24"/>
+          <w:szCs w:val="24"/>
+          <w:lang w:eastAsia="en-IN"/>
+        </w:rPr>
+        <w:t xml:space="preserve">: By default, </w:t>
+      </w:r>
+      <w:r>
+        <w:rPr>
+          <w:rFonts w:eastAsia="Times New Roman" w:cstheme="minorHAnsi"/>
+          <w:sz w:val="24"/>
+          <w:szCs w:val="24"/>
+          <w:highlight w:val="yellow"/>
+          <w:lang w:eastAsia="en-IN"/>
+        </w:rPr>
+        <w:t xml:space="preserve">any variables available in the parent view are automatically accessible in the </w:t>
+      </w:r>
+      <w:proofErr w:type="spellStart"/>
+      <w:r>
+        <w:rPr>
+          <w:rFonts w:eastAsia="Times New Roman" w:cstheme="minorHAnsi"/>
+          <w:sz w:val="24"/>
+          <w:szCs w:val="24"/>
+          <w:highlight w:val="yellow"/>
+          <w:lang w:eastAsia="en-IN"/>
+        </w:rPr>
+        <w:t>subview</w:t>
+      </w:r>
+      <w:proofErr w:type="spellEnd"/>
+      <w:r>
+        <w:rPr>
+          <w:rFonts w:eastAsia="Times New Roman" w:cstheme="minorHAnsi"/>
+          <w:sz w:val="24"/>
+          <w:szCs w:val="24"/>
+          <w:highlight w:val="yellow"/>
+          <w:lang w:eastAsia="en-IN"/>
+        </w:rPr>
+        <w:t>.</w:t>
+      </w:r>
+    </w:p>
+    <w:p>
+      <w:pPr>
+        <w:spacing w:after="0" w:line="240" w:lineRule="auto"/>
+        <w:rPr>
+          <w:rFonts w:eastAsia="Times New Roman" w:cstheme="minorHAnsi"/>
+          <w:sz w:val="24"/>
+          <w:szCs w:val="24"/>
+          <w:lang w:eastAsia="en-IN"/>
+        </w:rPr>
+      </w:pPr>
+    </w:p>
+    <w:p>
+      <w:pPr>
+        <w:spacing w:after="0" w:line="240" w:lineRule="auto"/>
+        <w:rPr>
+          <w:rFonts w:eastAsia="Times New Roman" w:cstheme="minorHAnsi"/>
+          <w:sz w:val="24"/>
+          <w:szCs w:val="24"/>
+          <w:lang w:eastAsia="en-IN"/>
+        </w:rPr>
+      </w:pPr>
+      <w:r>
+        <w:rPr>
+          <w:noProof/>
+          <w:lang w:eastAsia="en-IN"/>
+        </w:rPr>
+        <w:lastRenderedPageBreak/>
+        <w:drawing>
+          <wp:inline distT="0" distB="0" distL="0" distR="0" wp14:anchorId="207EDC52" wp14:editId="10A0BD56">
+            <wp:extent cx="3288831" cy="1849967"/>
+            <wp:effectExtent l="0" t="0" r="6985" b="0"/>
+            <wp:docPr id="8" name="Picture 8"/>
+            <wp:cNvGraphicFramePr>
+              <a:graphicFrameLocks xmlns:a="http://schemas.openxmlformats.org/drawingml/2006/main" noChangeAspect="1"/>
+            </wp:cNvGraphicFramePr>
+            <a:graphic xmlns:a="http://schemas.openxmlformats.org/drawingml/2006/main">
+              <a:graphicData uri="http://schemas.openxmlformats.org/drawingml/2006/picture">
+                <pic:pic xmlns:pic="http://schemas.openxmlformats.org/drawingml/2006/picture">
+                  <pic:nvPicPr>
+                    <pic:cNvPr id="0" name=""/>
+                    <pic:cNvPicPr/>
+                  </pic:nvPicPr>
+                  <pic:blipFill>
+                    <a:blip r:embed="rId15"/>
+                    <a:stretch>
+                      <a:fillRect/>
+                    </a:stretch>
+                  </pic:blipFill>
+                  <pic:spPr>
+                    <a:xfrm>
+                      <a:off x="0" y="0"/>
+                      <a:ext cx="3290488" cy="1850899"/>
+                    </a:xfrm>
+                    <a:prstGeom prst="rect">
+                      <a:avLst/>
+                    </a:prstGeom>
+                  </pic:spPr>
+                </pic:pic>
+              </a:graphicData>
+            </a:graphic>
+          </wp:inline>
+        </w:drawing>
+      </w:r>
+    </w:p>
+    <w:p>
+      <w:pPr>
+        <w:spacing w:after="0" w:line="240" w:lineRule="auto"/>
+        <w:rPr>
+          <w:rFonts w:eastAsia="Times New Roman" w:cstheme="minorHAnsi"/>
+          <w:sz w:val="24"/>
+          <w:szCs w:val="24"/>
+          <w:lang w:eastAsia="en-IN"/>
+        </w:rPr>
+      </w:pPr>
+    </w:p>
+    <w:p>
+      <w:pPr>
+        <w:spacing w:after="0" w:line="240" w:lineRule="auto"/>
+        <w:rPr>
+          <w:rFonts w:eastAsia="Times New Roman" w:cstheme="minorHAnsi"/>
+          <w:sz w:val="24"/>
+          <w:szCs w:val="24"/>
+          <w:lang w:eastAsia="en-IN"/>
+        </w:rPr>
+      </w:pPr>
+      <w:r>
+        <w:rPr>
+          <w:rFonts w:eastAsia="Times New Roman" w:cstheme="minorHAnsi"/>
+          <w:sz w:val="24"/>
+          <w:szCs w:val="24"/>
+          <w:lang w:eastAsia="en-IN"/>
+        </w:rPr>
+        <w:t xml:space="preserve">Use </w:t>
+      </w:r>
+      <w:proofErr w:type="gramStart"/>
+      <w:r>
+        <w:rPr>
+          <w:rFonts w:eastAsia="Times New Roman" w:cstheme="minorHAnsi"/>
+          <w:color w:val="548DD4" w:themeColor="text2" w:themeTint="99"/>
+          <w:sz w:val="24"/>
+          <w:szCs w:val="24"/>
+          <w:lang w:eastAsia="en-IN"/>
+        </w:rPr>
+        <w:t>@include(</w:t>
+      </w:r>
+      <w:proofErr w:type="gramEnd"/>
+      <w:r>
+        <w:rPr>
+          <w:rFonts w:eastAsia="Times New Roman" w:cstheme="minorHAnsi"/>
+          <w:color w:val="548DD4" w:themeColor="text2" w:themeTint="99"/>
+          <w:sz w:val="24"/>
+          <w:szCs w:val="24"/>
+          <w:lang w:eastAsia="en-IN"/>
+        </w:rPr>
+        <w:t>‘</w:t>
+      </w:r>
+      <w:r>
+        <w:rPr>
+          <w:rFonts w:eastAsia="Times New Roman" w:cstheme="minorHAnsi"/>
+          <w:sz w:val="24"/>
+          <w:szCs w:val="24"/>
+          <w:lang w:eastAsia="en-IN"/>
+        </w:rPr>
+        <w:t>filename</w:t>
+      </w:r>
+      <w:r>
+        <w:rPr>
+          <w:rFonts w:eastAsia="Times New Roman" w:cstheme="minorHAnsi"/>
+          <w:color w:val="548DD4" w:themeColor="text2" w:themeTint="99"/>
+          <w:sz w:val="24"/>
+          <w:szCs w:val="24"/>
+          <w:lang w:eastAsia="en-IN"/>
+        </w:rPr>
+        <w:t xml:space="preserve">’) </w:t>
+      </w:r>
+      <w:r>
+        <w:rPr>
+          <w:rFonts w:eastAsia="Times New Roman" w:cstheme="minorHAnsi"/>
+          <w:sz w:val="24"/>
+          <w:szCs w:val="24"/>
+          <w:lang w:eastAsia="en-IN"/>
+        </w:rPr>
+        <w:t>to call a sub view</w:t>
+      </w:r>
+    </w:p>
+    <w:p>
+      <w:pPr>
+        <w:spacing w:after="0" w:line="240" w:lineRule="auto"/>
+        <w:rPr>
+          <w:rFonts w:eastAsia="Times New Roman" w:cstheme="minorHAnsi"/>
+          <w:sz w:val="24"/>
+          <w:szCs w:val="24"/>
+          <w:lang w:eastAsia="en-IN"/>
+        </w:rPr>
+      </w:pPr>
+    </w:p>
+    <w:p>
+      <w:pPr>
+        <w:spacing w:after="0" w:line="240" w:lineRule="auto"/>
+        <w:rPr>
+          <w:rFonts w:eastAsia="Times New Roman" w:cstheme="minorHAnsi"/>
+          <w:sz w:val="24"/>
+          <w:szCs w:val="24"/>
+          <w:lang w:eastAsia="en-IN"/>
+        </w:rPr>
+      </w:pPr>
+    </w:p>
+    <w:p>
+      <w:pPr>
+        <w:spacing w:after="0" w:line="240" w:lineRule="auto"/>
+        <w:rPr>
+          <w:rFonts w:eastAsia="Times New Roman" w:cstheme="minorHAnsi"/>
+          <w:b/>
+          <w:bCs/>
+          <w:color w:val="FF0000"/>
+          <w:sz w:val="40"/>
+          <w:szCs w:val="40"/>
+          <w:u w:val="single"/>
+          <w:lang w:eastAsia="en-IN"/>
+        </w:rPr>
+      </w:pPr>
+      <w:r>
+        <w:rPr>
+          <w:rFonts w:eastAsia="Times New Roman" w:cstheme="minorHAnsi"/>
+          <w:b/>
+          <w:bCs/>
+          <w:color w:val="FF0000"/>
+          <w:sz w:val="40"/>
+          <w:szCs w:val="40"/>
+          <w:u w:val="single"/>
+          <w:lang w:eastAsia="en-IN"/>
+        </w:rPr>
+        <w:t>Components:</w:t>
+      </w:r>
+    </w:p>
+    <w:p>
+      <w:pPr>
+        <w:spacing w:after="0" w:line="240" w:lineRule="auto"/>
+        <w:rPr>
+          <w:rFonts w:eastAsia="Times New Roman" w:cstheme="minorHAnsi"/>
+          <w:b/>
+          <w:bCs/>
+          <w:color w:val="FF0000"/>
+          <w:sz w:val="40"/>
+          <w:szCs w:val="40"/>
+          <w:u w:val="single"/>
+          <w:lang w:eastAsia="en-IN"/>
+        </w:rPr>
+      </w:pPr>
+    </w:p>
+    <w:p>
+      <w:pPr>
+        <w:spacing w:after="0" w:line="240" w:lineRule="auto"/>
+        <w:rPr>
+          <w:rFonts w:eastAsia="Times New Roman" w:cstheme="minorHAnsi"/>
+          <w:sz w:val="24"/>
+          <w:szCs w:val="24"/>
+          <w:lang w:eastAsia="en-IN"/>
+        </w:rPr>
+      </w:pPr>
+      <w:r>
+        <w:rPr>
+          <w:rFonts w:eastAsia="Times New Roman" w:cstheme="minorHAnsi"/>
+          <w:sz w:val="24"/>
+          <w:szCs w:val="24"/>
+          <w:lang w:eastAsia="en-IN"/>
+        </w:rPr>
+        <w:t>Blade components are reusable, self-contained pieces of UI that act like custom HTML tags. They are the modern alternative to the @include (</w:t>
+      </w:r>
+      <w:proofErr w:type="spellStart"/>
+      <w:r>
+        <w:rPr>
+          <w:rFonts w:eastAsia="Times New Roman" w:cstheme="minorHAnsi"/>
+          <w:sz w:val="24"/>
+          <w:szCs w:val="24"/>
+          <w:lang w:eastAsia="en-IN"/>
+        </w:rPr>
+        <w:t>subview</w:t>
+      </w:r>
+      <w:proofErr w:type="spellEnd"/>
+      <w:r>
+        <w:rPr>
+          <w:rFonts w:eastAsia="Times New Roman" w:cstheme="minorHAnsi"/>
+          <w:sz w:val="24"/>
+          <w:szCs w:val="24"/>
+          <w:lang w:eastAsia="en-IN"/>
+        </w:rPr>
+        <w:t xml:space="preserve">) approach, offering better data handling and a cleaner syntax similar to frameworks like React or </w:t>
+      </w:r>
+      <w:proofErr w:type="spellStart"/>
+      <w:r>
+        <w:rPr>
+          <w:rFonts w:eastAsia="Times New Roman" w:cstheme="minorHAnsi"/>
+          <w:sz w:val="24"/>
+          <w:szCs w:val="24"/>
+          <w:lang w:eastAsia="en-IN"/>
+        </w:rPr>
+        <w:t>Vue</w:t>
+      </w:r>
+      <w:proofErr w:type="spellEnd"/>
+      <w:r>
+        <w:rPr>
+          <w:rFonts w:eastAsia="Times New Roman" w:cstheme="minorHAnsi"/>
+          <w:sz w:val="24"/>
+          <w:szCs w:val="24"/>
+          <w:lang w:eastAsia="en-IN"/>
+        </w:rPr>
+        <w:t>.</w:t>
+      </w:r>
+    </w:p>
+    <w:p>
+      <w:pPr>
+        <w:spacing w:after="0" w:line="240" w:lineRule="auto"/>
+        <w:rPr>
+          <w:rFonts w:eastAsia="Times New Roman" w:cstheme="minorHAnsi"/>
+          <w:sz w:val="24"/>
+          <w:szCs w:val="24"/>
+          <w:lang w:eastAsia="en-IN"/>
+        </w:rPr>
+      </w:pPr>
+    </w:p>
+    <w:p>
+      <w:pPr>
+        <w:spacing w:after="0" w:line="240" w:lineRule="auto"/>
+        <w:rPr>
+          <w:rFonts w:eastAsia="Times New Roman" w:cstheme="minorHAnsi"/>
+          <w:b/>
+          <w:bCs/>
+          <w:sz w:val="24"/>
+          <w:szCs w:val="24"/>
+          <w:lang w:eastAsia="en-IN"/>
+        </w:rPr>
+      </w:pPr>
+      <w:r>
+        <w:rPr>
+          <w:rFonts w:eastAsia="Times New Roman" w:cstheme="minorHAnsi"/>
+          <w:b/>
+          <w:bCs/>
+          <w:sz w:val="24"/>
+          <w:szCs w:val="24"/>
+          <w:lang w:eastAsia="en-IN"/>
+        </w:rPr>
+        <w:t>Q: why use component over sub views?</w:t>
+      </w:r>
+      <w:r>
+        <w:rPr>
+          <w:rFonts w:eastAsia="Times New Roman" w:cstheme="minorHAnsi"/>
+          <w:b/>
+          <w:bCs/>
+          <w:sz w:val="24"/>
+          <w:szCs w:val="24"/>
+          <w:lang w:eastAsia="en-IN"/>
+        </w:rPr>
+        <w:br/>
+      </w:r>
+    </w:p>
+    <w:p>
+      <w:pPr>
+        <w:rPr>
+          <w:rFonts w:ascii="Arial" w:eastAsia="Times New Roman" w:hAnsi="Arial" w:cs="Arial"/>
+          <w:b/>
+          <w:bCs/>
+          <w:sz w:val="30"/>
+          <w:szCs w:val="30"/>
+          <w:lang w:eastAsia="en-IN"/>
+        </w:rPr>
+      </w:pPr>
+      <w:proofErr w:type="spellStart"/>
+      <w:r>
+        <w:rPr>
+          <w:rFonts w:eastAsia="Times New Roman" w:cstheme="minorHAnsi"/>
+          <w:b/>
+          <w:bCs/>
+          <w:sz w:val="24"/>
+          <w:szCs w:val="24"/>
+          <w:lang w:eastAsia="en-IN"/>
+        </w:rPr>
+        <w:t>Ans</w:t>
+      </w:r>
+      <w:proofErr w:type="spellEnd"/>
+      <w:r>
+        <w:rPr>
+          <w:rFonts w:eastAsia="Times New Roman" w:cstheme="minorHAnsi"/>
+          <w:b/>
+          <w:bCs/>
+          <w:sz w:val="24"/>
+          <w:szCs w:val="24"/>
+          <w:lang w:eastAsia="en-IN"/>
+        </w:rPr>
+        <w:t>:</w:t>
+      </w:r>
+      <w:r>
+        <w:rPr>
+          <w:rFonts w:eastAsia="Times New Roman" w:cstheme="minorHAnsi"/>
+          <w:b/>
+          <w:bCs/>
+          <w:sz w:val="24"/>
+          <w:szCs w:val="24"/>
+          <w:lang w:eastAsia="en-IN"/>
+        </w:rPr>
+        <w:t xml:space="preserve"> </w:t>
+      </w:r>
+      <w:r>
+        <w:rPr>
+          <w:rFonts w:eastAsia="Times New Roman" w:cstheme="minorHAnsi"/>
+          <w:sz w:val="24"/>
+          <w:szCs w:val="24"/>
+          <w:lang w:eastAsia="en-IN"/>
+        </w:rPr>
+        <w:t xml:space="preserve">While </w:t>
+      </w:r>
+      <w:proofErr w:type="spellStart"/>
+      <w:r>
+        <w:rPr>
+          <w:rFonts w:eastAsia="Times New Roman" w:cstheme="minorHAnsi"/>
+          <w:sz w:val="24"/>
+          <w:szCs w:val="24"/>
+          <w:lang w:eastAsia="en-IN"/>
+        </w:rPr>
+        <w:t>subviews</w:t>
+      </w:r>
+      <w:proofErr w:type="spellEnd"/>
+      <w:r>
+        <w:rPr>
+          <w:rFonts w:eastAsia="Times New Roman" w:cstheme="minorHAnsi"/>
+          <w:sz w:val="24"/>
+          <w:szCs w:val="24"/>
+          <w:lang w:eastAsia="en-IN"/>
+        </w:rPr>
+        <w:t xml:space="preserve"> just "copy-paste" code, components offer:</w:t>
+      </w:r>
+    </w:p>
+    <w:p>
+      <w:pPr>
+        <w:pStyle w:val="ListParagraph"/>
+        <w:numPr>
+          <w:ilvl w:val="0"/>
+          <w:numId w:val="7"/>
+        </w:numPr>
+        <w:spacing w:after="0" w:line="240" w:lineRule="auto"/>
+        <w:rPr>
+          <w:rFonts w:eastAsia="Times New Roman" w:cstheme="minorHAnsi"/>
+          <w:sz w:val="24"/>
+          <w:szCs w:val="24"/>
+          <w:lang w:eastAsia="en-IN"/>
+        </w:rPr>
+      </w:pPr>
+      <w:r>
+        <w:rPr>
+          <w:rFonts w:eastAsia="Times New Roman" w:cstheme="minorHAnsi"/>
+          <w:b/>
+          <w:bCs/>
+          <w:sz w:val="24"/>
+          <w:szCs w:val="24"/>
+          <w:lang w:eastAsia="en-IN"/>
+        </w:rPr>
+        <w:t>Encapsulation</w:t>
+      </w:r>
+      <w:r>
+        <w:rPr>
+          <w:rFonts w:eastAsia="Times New Roman" w:cstheme="minorHAnsi"/>
+          <w:sz w:val="24"/>
+          <w:szCs w:val="24"/>
+          <w:lang w:eastAsia="en-IN"/>
+        </w:rPr>
+        <w:t>: Variables inside a component won't accidentally overwrite variables in your main page.</w:t>
+      </w:r>
+    </w:p>
+    <w:p>
+      <w:pPr>
+        <w:pStyle w:val="ListParagraph"/>
+        <w:numPr>
+          <w:ilvl w:val="0"/>
+          <w:numId w:val="7"/>
+        </w:numPr>
+        <w:spacing w:after="0" w:line="240" w:lineRule="auto"/>
+        <w:rPr>
+          <w:rFonts w:eastAsia="Times New Roman" w:cstheme="minorHAnsi"/>
+          <w:sz w:val="24"/>
+          <w:szCs w:val="24"/>
+          <w:lang w:eastAsia="en-IN"/>
+        </w:rPr>
+      </w:pPr>
+      <w:r>
+        <w:rPr>
+          <w:rFonts w:eastAsia="Times New Roman" w:cstheme="minorHAnsi"/>
+          <w:b/>
+          <w:bCs/>
+          <w:sz w:val="24"/>
+          <w:szCs w:val="24"/>
+          <w:lang w:eastAsia="en-IN"/>
+        </w:rPr>
+        <w:t>Slots</w:t>
+      </w:r>
+      <w:r>
+        <w:rPr>
+          <w:rFonts w:eastAsia="Times New Roman" w:cstheme="minorHAnsi"/>
+          <w:sz w:val="24"/>
+          <w:szCs w:val="24"/>
+          <w:lang w:eastAsia="en-IN"/>
+        </w:rPr>
+        <w:t>: You can inject custom HTML content into a specific part of a component.</w:t>
+      </w:r>
+    </w:p>
+    <w:p>
+      <w:pPr>
+        <w:pStyle w:val="ListParagraph"/>
+        <w:numPr>
+          <w:ilvl w:val="0"/>
+          <w:numId w:val="7"/>
+        </w:numPr>
+        <w:spacing w:after="0" w:line="240" w:lineRule="auto"/>
+        <w:rPr>
+          <w:rFonts w:eastAsia="Times New Roman" w:cstheme="minorHAnsi"/>
+          <w:sz w:val="24"/>
+          <w:szCs w:val="24"/>
+          <w:lang w:eastAsia="en-IN"/>
+        </w:rPr>
+      </w:pPr>
+      <w:r>
+        <w:rPr>
+          <w:rFonts w:eastAsia="Times New Roman" w:cstheme="minorHAnsi"/>
+          <w:b/>
+          <w:bCs/>
+          <w:sz w:val="24"/>
+          <w:szCs w:val="24"/>
+          <w:lang w:eastAsia="en-IN"/>
+        </w:rPr>
+        <w:t>Props</w:t>
+      </w:r>
+      <w:r>
+        <w:rPr>
+          <w:rFonts w:eastAsia="Times New Roman" w:cstheme="minorHAnsi"/>
+          <w:sz w:val="24"/>
+          <w:szCs w:val="24"/>
+          <w:lang w:eastAsia="en-IN"/>
+        </w:rPr>
+        <w:t>: A formal way to define which data a component requires.</w:t>
+      </w:r>
+    </w:p>
+    <w:p>
+      <w:pPr>
+        <w:spacing w:after="0" w:line="240" w:lineRule="auto"/>
+        <w:rPr>
+          <w:rFonts w:eastAsia="Times New Roman" w:cstheme="minorHAnsi"/>
+          <w:b/>
+          <w:bCs/>
+          <w:sz w:val="24"/>
+          <w:szCs w:val="24"/>
+          <w:lang w:eastAsia="en-IN"/>
+        </w:rPr>
+      </w:pPr>
+    </w:p>
+    <w:p>
+      <w:pPr>
+        <w:spacing w:after="0" w:line="240" w:lineRule="auto"/>
+        <w:rPr>
+          <w:rFonts w:eastAsia="Times New Roman" w:cstheme="minorHAnsi"/>
+          <w:sz w:val="24"/>
+          <w:szCs w:val="24"/>
+          <w:lang w:eastAsia="en-IN"/>
+        </w:rPr>
+      </w:pPr>
+    </w:p>
+    <w:p>
+      <w:pPr>
+        <w:spacing w:after="0" w:line="240" w:lineRule="auto"/>
+        <w:rPr>
+          <w:rFonts w:eastAsia="Times New Roman" w:cstheme="minorHAnsi"/>
+          <w:sz w:val="24"/>
+          <w:szCs w:val="24"/>
+          <w:lang w:eastAsia="en-IN"/>
+        </w:rPr>
+      </w:pPr>
+    </w:p>
+    <w:p>
+      <w:pPr>
+        <w:spacing w:after="0" w:line="240" w:lineRule="auto"/>
+        <w:rPr>
+          <w:rFonts w:eastAsia="Times New Roman" w:cstheme="minorHAnsi"/>
+          <w:sz w:val="24"/>
+          <w:szCs w:val="24"/>
+          <w:lang w:eastAsia="en-IN"/>
+        </w:rPr>
+      </w:pPr>
+      <w:r>
+        <w:rPr>
+          <w:noProof/>
+          <w:lang w:eastAsia="en-IN"/>
+        </w:rPr>
+        <w:drawing>
+          <wp:inline distT="0" distB="0" distL="0" distR="0" wp14:anchorId="2DCA3A88" wp14:editId="78219116">
+            <wp:extent cx="3958637" cy="2226733"/>
+            <wp:effectExtent l="0" t="0" r="3810" b="2540"/>
+            <wp:docPr id="9" name="Picture 9"/>
+            <wp:cNvGraphicFramePr>
+              <a:graphicFrameLocks xmlns:a="http://schemas.openxmlformats.org/drawingml/2006/main" noChangeAspect="1"/>
+            </wp:cNvGraphicFramePr>
+            <a:graphic xmlns:a="http://schemas.openxmlformats.org/drawingml/2006/main">
+              <a:graphicData uri="http://schemas.openxmlformats.org/drawingml/2006/picture">
+                <pic:pic xmlns:pic="http://schemas.openxmlformats.org/drawingml/2006/picture">
+                  <pic:nvPicPr>
+                    <pic:cNvPr id="0" name=""/>
+                    <pic:cNvPicPr/>
+                  </pic:nvPicPr>
+                  <pic:blipFill>
+                    <a:blip r:embed="rId16"/>
+                    <a:stretch>
+                      <a:fillRect/>
+                    </a:stretch>
+                  </pic:blipFill>
+                  <pic:spPr>
+                    <a:xfrm>
+                      <a:off x="0" y="0"/>
+                      <a:ext cx="3958344" cy="2226568"/>
+                    </a:xfrm>
+                    <a:prstGeom prst="rect">
+                      <a:avLst/>
+                    </a:prstGeom>
+                  </pic:spPr>
+                </pic:pic>
+              </a:graphicData>
+            </a:graphic>
+          </wp:inline>
+        </w:drawing>
+      </w:r>
+    </w:p>
+    <w:p>
+      <w:pPr>
+        <w:rPr>
+          <w:szCs w:val="22"/>
+        </w:rPr>
+      </w:pPr>
+    </w:p>
+    <w:p>
+      <w:pPr>
+        <w:rPr>
+          <w:szCs w:val="22"/>
+        </w:rPr>
+      </w:pPr>
+      <w:r>
+        <w:rPr>
+          <w:szCs w:val="22"/>
+        </w:rPr>
+        <w:t>To call a component in a view file:-</w:t>
+      </w:r>
+      <w:r>
+        <w:rPr>
+          <w:szCs w:val="22"/>
+        </w:rPr>
+        <w:t xml:space="preserve"> </w:t>
+      </w:r>
       <w:bookmarkStart w:id="0" w:name="_GoBack"/>
       <w:bookmarkEnd w:id="0"/>
+      <w:r>
+        <w:rPr>
+          <w:b/>
+          <w:bCs/>
+          <w:color w:val="548DD4" w:themeColor="text2" w:themeTint="99"/>
+          <w:szCs w:val="22"/>
+        </w:rPr>
+        <w:t>&lt;x-</w:t>
+      </w:r>
+      <w:r>
+        <w:rPr>
+          <w:b/>
+          <w:bCs/>
+          <w:szCs w:val="22"/>
+        </w:rPr>
+        <w:t>filename</w:t>
+      </w:r>
+      <w:r>
+        <w:rPr>
+          <w:b/>
+          <w:bCs/>
+          <w:color w:val="548DD4" w:themeColor="text2" w:themeTint="99"/>
+          <w:szCs w:val="22"/>
+        </w:rPr>
+        <w:t>/&gt;</w:t>
+      </w:r>
+    </w:p>
+    <w:p>
+      <w:pPr>
+        <w:rPr>
+          <w:szCs w:val="22"/>
+        </w:rPr>
+      </w:pPr>
     </w:p>
     <w:sectPr>
       <w:pgSz w:w="11906" w:h="16838"/>
@@ -4386,16 +5320,165 @@
 <file path=word/numbering.xml><?xml version="1.0" encoding="utf-8"?>
 <w:numbering xmlns:wpc="http://schemas.microsoft.com/office/word/2010/wordprocessingCanvas" xmlns:mc="http://schemas.openxmlformats.org/markup-compatibility/2006" xmlns:o="urn:schemas-microsoft-com:office:office" xmlns:r="http://schemas.openxmlformats.org/officeDocument/2006/relationships" xmlns:m="http://schemas.openxmlformats.org/officeDocument/2006/math" xmlns:v="urn:schemas-microsoft-com:vml" xmlns:wp14="http://schemas.microsoft.com/office/word/2010/wordprocessingDrawing" xmlns:wp="http://schemas.openxmlformats.org/drawingml/2006/wordprocessingDrawing" xmlns:w10="urn:schemas-microsoft-com:office:word" xmlns:w="http://schemas.openxmlformats.org/wordprocessingml/2006/main" xmlns:w14="http://schemas.microsoft.com/office/word/2010/wordml" xmlns:wpg="http://schemas.microsoft.com/office/word/2010/wordprocessingGroup" xmlns:wpi="http://schemas.microsoft.com/office/word/2010/wordprocessingInk" xmlns:wne="http://schemas.microsoft.com/office/word/2006/wordml" xmlns:wps="http://schemas.microsoft.com/office/word/2010/wordprocessingShape" mc:Ignorable="w14 wp14">
   <w:abstractNum w:abstractNumId="0">
-    <w:nsid w:val="2C445AB2"/>
+    <w:nsid w:val="0F0E39DA"/>
+    <w:multiLevelType w:val="multilevel"/>
+    <w:tmpl w:val="490008D4"/>
+    <w:lvl w:ilvl="0">
+      <w:start w:val="1"/>
+      <w:numFmt w:val="bullet"/>
+      <w:lvlText w:val=""/>
+      <w:lvlJc w:val="left"/>
+      <w:pPr>
+        <w:tabs>
+          <w:tab w:val="num" w:pos="720"/>
+        </w:tabs>
+        <w:ind w:left="720" w:hanging="360"/>
+      </w:pPr>
+      <w:rPr>
+        <w:rFonts w:ascii="Symbol" w:hAnsi="Symbol" w:hint="default"/>
+        <w:sz w:val="20"/>
+      </w:rPr>
+    </w:lvl>
+    <w:lvl w:ilvl="1" w:tentative="1">
+      <w:start w:val="1"/>
+      <w:numFmt w:val="bullet"/>
+      <w:lvlText w:val="o"/>
+      <w:lvlJc w:val="left"/>
+      <w:pPr>
+        <w:tabs>
+          <w:tab w:val="num" w:pos="1440"/>
+        </w:tabs>
+        <w:ind w:left="1440" w:hanging="360"/>
+      </w:pPr>
+      <w:rPr>
+        <w:rFonts w:ascii="Courier New" w:hAnsi="Courier New" w:hint="default"/>
+        <w:sz w:val="20"/>
+      </w:rPr>
+    </w:lvl>
+    <w:lvl w:ilvl="2" w:tentative="1">
+      <w:start w:val="1"/>
+      <w:numFmt w:val="bullet"/>
+      <w:lvlText w:val=""/>
+      <w:lvlJc w:val="left"/>
+      <w:pPr>
+        <w:tabs>
+          <w:tab w:val="num" w:pos="2160"/>
+        </w:tabs>
+        <w:ind w:left="2160" w:hanging="360"/>
+      </w:pPr>
+      <w:rPr>
+        <w:rFonts w:ascii="Wingdings" w:hAnsi="Wingdings" w:hint="default"/>
+        <w:sz w:val="20"/>
+      </w:rPr>
+    </w:lvl>
+    <w:lvl w:ilvl="3" w:tentative="1">
+      <w:start w:val="1"/>
+      <w:numFmt w:val="bullet"/>
+      <w:lvlText w:val=""/>
+      <w:lvlJc w:val="left"/>
+      <w:pPr>
+        <w:tabs>
+          <w:tab w:val="num" w:pos="2880"/>
+        </w:tabs>
+        <w:ind w:left="2880" w:hanging="360"/>
+      </w:pPr>
+      <w:rPr>
+        <w:rFonts w:ascii="Wingdings" w:hAnsi="Wingdings" w:hint="default"/>
+        <w:sz w:val="20"/>
+      </w:rPr>
+    </w:lvl>
+    <w:lvl w:ilvl="4" w:tentative="1">
+      <w:start w:val="1"/>
+      <w:numFmt w:val="bullet"/>
+      <w:lvlText w:val=""/>
+      <w:lvlJc w:val="left"/>
+      <w:pPr>
+        <w:tabs>
+          <w:tab w:val="num" w:pos="3600"/>
+        </w:tabs>
+        <w:ind w:left="3600" w:hanging="360"/>
+      </w:pPr>
+      <w:rPr>
+        <w:rFonts w:ascii="Wingdings" w:hAnsi="Wingdings" w:hint="default"/>
+        <w:sz w:val="20"/>
+      </w:rPr>
+    </w:lvl>
+    <w:lvl w:ilvl="5" w:tentative="1">
+      <w:start w:val="1"/>
+      <w:numFmt w:val="bullet"/>
+      <w:lvlText w:val=""/>
+      <w:lvlJc w:val="left"/>
+      <w:pPr>
+        <w:tabs>
+          <w:tab w:val="num" w:pos="4320"/>
+        </w:tabs>
+        <w:ind w:left="4320" w:hanging="360"/>
+      </w:pPr>
+      <w:rPr>
+        <w:rFonts w:ascii="Wingdings" w:hAnsi="Wingdings" w:hint="default"/>
+        <w:sz w:val="20"/>
+      </w:rPr>
+    </w:lvl>
+    <w:lvl w:ilvl="6" w:tentative="1">
+      <w:start w:val="1"/>
+      <w:numFmt w:val="bullet"/>
+      <w:lvlText w:val=""/>
+      <w:lvlJc w:val="left"/>
+      <w:pPr>
+        <w:tabs>
+          <w:tab w:val="num" w:pos="5040"/>
+        </w:tabs>
+        <w:ind w:left="5040" w:hanging="360"/>
+      </w:pPr>
+      <w:rPr>
+        <w:rFonts w:ascii="Wingdings" w:hAnsi="Wingdings" w:hint="default"/>
+        <w:sz w:val="20"/>
+      </w:rPr>
+    </w:lvl>
+    <w:lvl w:ilvl="7" w:tentative="1">
+      <w:start w:val="1"/>
+      <w:numFmt w:val="bullet"/>
+      <w:lvlText w:val=""/>
+      <w:lvlJc w:val="left"/>
+      <w:pPr>
+        <w:tabs>
+          <w:tab w:val="num" w:pos="5760"/>
+        </w:tabs>
+        <w:ind w:left="5760" w:hanging="360"/>
+      </w:pPr>
+      <w:rPr>
+        <w:rFonts w:ascii="Wingdings" w:hAnsi="Wingdings" w:hint="default"/>
+        <w:sz w:val="20"/>
+      </w:rPr>
+    </w:lvl>
+    <w:lvl w:ilvl="8" w:tentative="1">
+      <w:start w:val="1"/>
+      <w:numFmt w:val="bullet"/>
+      <w:lvlText w:val=""/>
+      <w:lvlJc w:val="left"/>
+      <w:pPr>
+        <w:tabs>
+          <w:tab w:val="num" w:pos="6480"/>
+        </w:tabs>
+        <w:ind w:left="6480" w:hanging="360"/>
+      </w:pPr>
+      <w:rPr>
+        <w:rFonts w:ascii="Wingdings" w:hAnsi="Wingdings" w:hint="default"/>
+        <w:sz w:val="20"/>
+      </w:rPr>
+    </w:lvl>
+  </w:abstractNum>
+  <w:abstractNum w:abstractNumId="1">
+    <w:nsid w:val="26302E5D"/>
     <w:multiLevelType w:val="hybridMultilevel"/>
-    <w:tmpl w:val="61CAFDD2"/>
+    <w:tmpl w:val="4AA8893E"/>
     <w:lvl w:ilvl="0" w:tplc="40090001">
       <w:start w:val="1"/>
       <w:numFmt w:val="bullet"/>
       <w:lvlText w:val=""/>
       <w:lvlJc w:val="left"/>
       <w:pPr>
-        <w:ind w:left="1080" w:hanging="360"/>
+        <w:ind w:left="720" w:hanging="360"/>
       </w:pPr>
       <w:rPr>
         <w:rFonts w:ascii="Symbol" w:hAnsi="Symbol" w:hint="default"/>
@@ -4407,7 +5490,7 @@
       <w:lvlText w:val="o"/>
       <w:lvlJc w:val="left"/>
       <w:pPr>
-        <w:ind w:left="1800" w:hanging="360"/>
+        <w:ind w:left="1440" w:hanging="360"/>
       </w:pPr>
       <w:rPr>
         <w:rFonts w:ascii="Courier New" w:hAnsi="Courier New" w:cs="Courier New" w:hint="default"/>
@@ -4419,7 +5502,7 @@
       <w:lvlText w:val=""/>
       <w:lvlJc w:val="left"/>
       <w:pPr>
-        <w:ind w:left="2520" w:hanging="360"/>
+        <w:ind w:left="2160" w:hanging="360"/>
       </w:pPr>
       <w:rPr>
         <w:rFonts w:ascii="Wingdings" w:hAnsi="Wingdings" w:hint="default"/>
@@ -4431,7 +5514,7 @@
       <w:lvlText w:val=""/>
       <w:lvlJc w:val="left"/>
       <w:pPr>
-        <w:ind w:left="3240" w:hanging="360"/>
+        <w:ind w:left="2880" w:hanging="360"/>
       </w:pPr>
       <w:rPr>
         <w:rFonts w:ascii="Symbol" w:hAnsi="Symbol" w:hint="default"/>
@@ -4443,7 +5526,7 @@
       <w:lvlText w:val="o"/>
       <w:lvlJc w:val="left"/>
       <w:pPr>
-        <w:ind w:left="3960" w:hanging="360"/>
+        <w:ind w:left="3600" w:hanging="360"/>
       </w:pPr>
       <w:rPr>
         <w:rFonts w:ascii="Courier New" w:hAnsi="Courier New" w:cs="Courier New" w:hint="default"/>
@@ -4455,7 +5538,7 @@
       <w:lvlText w:val=""/>
       <w:lvlJc w:val="left"/>
       <w:pPr>
-        <w:ind w:left="4680" w:hanging="360"/>
+        <w:ind w:left="4320" w:hanging="360"/>
       </w:pPr>
       <w:rPr>
         <w:rFonts w:ascii="Wingdings" w:hAnsi="Wingdings" w:hint="default"/>
@@ -4467,7 +5550,7 @@
       <w:lvlText w:val=""/>
       <w:lvlJc w:val="left"/>
       <w:pPr>
-        <w:ind w:left="5400" w:hanging="360"/>
+        <w:ind w:left="5040" w:hanging="360"/>
       </w:pPr>
       <w:rPr>
         <w:rFonts w:ascii="Symbol" w:hAnsi="Symbol" w:hint="default"/>
@@ -4479,7 +5562,7 @@
       <w:lvlText w:val="o"/>
       <w:lvlJc w:val="left"/>
       <w:pPr>
-        <w:ind w:left="6120" w:hanging="360"/>
+        <w:ind w:left="5760" w:hanging="360"/>
       </w:pPr>
       <w:rPr>
         <w:rFonts w:ascii="Courier New" w:hAnsi="Courier New" w:cs="Courier New" w:hint="default"/>
@@ -4491,110 +5574,24 @@
       <w:lvlText w:val=""/>
       <w:lvlJc w:val="left"/>
       <w:pPr>
-        <w:ind w:left="6840" w:hanging="360"/>
+        <w:ind w:left="6480" w:hanging="360"/>
       </w:pPr>
       <w:rPr>
         <w:rFonts w:ascii="Wingdings" w:hAnsi="Wingdings" w:hint="default"/>
       </w:rPr>
     </w:lvl>
   </w:abstractNum>
-  <w:abstractNum w:abstractNumId="1">
-    <w:nsid w:val="30317697"/>
+  <w:abstractNum w:abstractNumId="2">
+    <w:nsid w:val="2C445AB2"/>
     <w:multiLevelType w:val="hybridMultilevel"/>
-    <w:tmpl w:val="B03EB28C"/>
-    <w:lvl w:ilvl="0" w:tplc="4009000F">
-      <w:start w:val="1"/>
-      <w:numFmt w:val="decimal"/>
-      <w:lvlText w:val="%1."/>
-      <w:lvlJc w:val="left"/>
-      <w:pPr>
-        <w:ind w:left="720" w:hanging="360"/>
-      </w:pPr>
-    </w:lvl>
-    <w:lvl w:ilvl="1" w:tplc="40090019" w:tentative="1">
-      <w:start w:val="1"/>
-      <w:numFmt w:val="lowerLetter"/>
-      <w:lvlText w:val="%2."/>
-      <w:lvlJc w:val="left"/>
-      <w:pPr>
-        <w:ind w:left="1440" w:hanging="360"/>
-      </w:pPr>
-    </w:lvl>
-    <w:lvl w:ilvl="2" w:tplc="4009001B" w:tentative="1">
-      <w:start w:val="1"/>
-      <w:numFmt w:val="lowerRoman"/>
-      <w:lvlText w:val="%3."/>
-      <w:lvlJc w:val="right"/>
-      <w:pPr>
-        <w:ind w:left="2160" w:hanging="180"/>
-      </w:pPr>
-    </w:lvl>
-    <w:lvl w:ilvl="3" w:tplc="4009000F" w:tentative="1">
-      <w:start w:val="1"/>
-      <w:numFmt w:val="decimal"/>
-      <w:lvlText w:val="%4."/>
-      <w:lvlJc w:val="left"/>
-      <w:pPr>
-        <w:ind w:left="2880" w:hanging="360"/>
-      </w:pPr>
-    </w:lvl>
-    <w:lvl w:ilvl="4" w:tplc="40090019" w:tentative="1">
-      <w:start w:val="1"/>
-      <w:numFmt w:val="lowerLetter"/>
-      <w:lvlText w:val="%5."/>
-      <w:lvlJc w:val="left"/>
-      <w:pPr>
-        <w:ind w:left="3600" w:hanging="360"/>
-      </w:pPr>
-    </w:lvl>
-    <w:lvl w:ilvl="5" w:tplc="4009001B" w:tentative="1">
-      <w:start w:val="1"/>
-      <w:numFmt w:val="lowerRoman"/>
-      <w:lvlText w:val="%6."/>
-      <w:lvlJc w:val="right"/>
-      <w:pPr>
-        <w:ind w:left="4320" w:hanging="180"/>
-      </w:pPr>
-    </w:lvl>
-    <w:lvl w:ilvl="6" w:tplc="4009000F" w:tentative="1">
-      <w:start w:val="1"/>
-      <w:numFmt w:val="decimal"/>
-      <w:lvlText w:val="%7."/>
-      <w:lvlJc w:val="left"/>
-      <w:pPr>
-        <w:ind w:left="5040" w:hanging="360"/>
-      </w:pPr>
-    </w:lvl>
-    <w:lvl w:ilvl="7" w:tplc="40090019" w:tentative="1">
-      <w:start w:val="1"/>
-      <w:numFmt w:val="lowerLetter"/>
-      <w:lvlText w:val="%8."/>
-      <w:lvlJc w:val="left"/>
-      <w:pPr>
-        <w:ind w:left="5760" w:hanging="360"/>
-      </w:pPr>
-    </w:lvl>
-    <w:lvl w:ilvl="8" w:tplc="4009001B" w:tentative="1">
-      <w:start w:val="1"/>
-      <w:numFmt w:val="lowerRoman"/>
-      <w:lvlText w:val="%9."/>
-      <w:lvlJc w:val="right"/>
-      <w:pPr>
-        <w:ind w:left="6480" w:hanging="180"/>
-      </w:pPr>
-    </w:lvl>
-  </w:abstractNum>
-  <w:abstractNum w:abstractNumId="2">
-    <w:nsid w:val="387058FD"/>
-    <w:multiLevelType w:val="hybridMultilevel"/>
-    <w:tmpl w:val="BB100E0E"/>
+    <w:tmpl w:val="7688DDA0"/>
     <w:lvl w:ilvl="0" w:tplc="40090001">
       <w:start w:val="1"/>
       <w:numFmt w:val="bullet"/>
       <w:lvlText w:val=""/>
       <w:lvlJc w:val="left"/>
       <w:pPr>
-        <w:ind w:left="720" w:hanging="360"/>
+        <w:ind w:left="1080" w:hanging="360"/>
       </w:pPr>
       <w:rPr>
         <w:rFonts w:ascii="Symbol" w:hAnsi="Symbol" w:hint="default"/>
@@ -4606,7 +5603,7 @@
       <w:lvlText w:val="o"/>
       <w:lvlJc w:val="left"/>
       <w:pPr>
-        <w:ind w:left="1440" w:hanging="360"/>
+        <w:ind w:left="1800" w:hanging="360"/>
       </w:pPr>
       <w:rPr>
         <w:rFonts w:ascii="Courier New" w:hAnsi="Courier New" w:cs="Courier New" w:hint="default"/>
@@ -4618,7 +5615,7 @@
       <w:lvlText w:val=""/>
       <w:lvlJc w:val="left"/>
       <w:pPr>
-        <w:ind w:left="2160" w:hanging="360"/>
+        <w:ind w:left="2520" w:hanging="360"/>
       </w:pPr>
       <w:rPr>
         <w:rFonts w:ascii="Wingdings" w:hAnsi="Wingdings" w:hint="default"/>
@@ -4630,7 +5627,7 @@
       <w:lvlText w:val=""/>
       <w:lvlJc w:val="left"/>
       <w:pPr>
-        <w:ind w:left="2880" w:hanging="360"/>
+        <w:ind w:left="3240" w:hanging="360"/>
       </w:pPr>
       <w:rPr>
         <w:rFonts w:ascii="Symbol" w:hAnsi="Symbol" w:hint="default"/>
@@ -4642,7 +5639,7 @@
       <w:lvlText w:val="o"/>
       <w:lvlJc w:val="left"/>
       <w:pPr>
-        <w:ind w:left="3600" w:hanging="360"/>
+        <w:ind w:left="3960" w:hanging="360"/>
       </w:pPr>
       <w:rPr>
         <w:rFonts w:ascii="Courier New" w:hAnsi="Courier New" w:cs="Courier New" w:hint="default"/>
@@ -4654,7 +5651,7 @@
       <w:lvlText w:val=""/>
       <w:lvlJc w:val="left"/>
       <w:pPr>
-        <w:ind w:left="4320" w:hanging="360"/>
+        <w:ind w:left="4680" w:hanging="360"/>
       </w:pPr>
       <w:rPr>
         <w:rFonts w:ascii="Wingdings" w:hAnsi="Wingdings" w:hint="default"/>
@@ -4666,7 +5663,7 @@
       <w:lvlText w:val=""/>
       <w:lvlJc w:val="left"/>
       <w:pPr>
-        <w:ind w:left="5040" w:hanging="360"/>
+        <w:ind w:left="5400" w:hanging="360"/>
       </w:pPr>
       <w:rPr>
         <w:rFonts w:ascii="Symbol" w:hAnsi="Symbol" w:hint="default"/>
@@ -4678,7 +5675,7 @@
       <w:lvlText w:val="o"/>
       <w:lvlJc w:val="left"/>
       <w:pPr>
-        <w:ind w:left="5760" w:hanging="360"/>
+        <w:ind w:left="6120" w:hanging="360"/>
       </w:pPr>
       <w:rPr>
         <w:rFonts w:ascii="Courier New" w:hAnsi="Courier New" w:cs="Courier New" w:hint="default"/>
@@ -4690,7 +5687,7 @@
       <w:lvlText w:val=""/>
       <w:lvlJc w:val="left"/>
       <w:pPr>
-        <w:ind w:left="6480" w:hanging="360"/>
+        <w:ind w:left="6840" w:hanging="360"/>
       </w:pPr>
       <w:rPr>
         <w:rFonts w:ascii="Wingdings" w:hAnsi="Wingdings" w:hint="default"/>
@@ -4698,9 +5695,95 @@
     </w:lvl>
   </w:abstractNum>
   <w:abstractNum w:abstractNumId="3">
-    <w:nsid w:val="769E6830"/>
+    <w:nsid w:val="30317697"/>
     <w:multiLevelType w:val="hybridMultilevel"/>
-    <w:tmpl w:val="9196B5D2"/>
+    <w:tmpl w:val="B03EB28C"/>
+    <w:lvl w:ilvl="0" w:tplc="4009000F">
+      <w:start w:val="1"/>
+      <w:numFmt w:val="decimal"/>
+      <w:lvlText w:val="%1."/>
+      <w:lvlJc w:val="left"/>
+      <w:pPr>
+        <w:ind w:left="720" w:hanging="360"/>
+      </w:pPr>
+    </w:lvl>
+    <w:lvl w:ilvl="1" w:tplc="40090019" w:tentative="1">
+      <w:start w:val="1"/>
+      <w:numFmt w:val="lowerLetter"/>
+      <w:lvlText w:val="%2."/>
+      <w:lvlJc w:val="left"/>
+      <w:pPr>
+        <w:ind w:left="1440" w:hanging="360"/>
+      </w:pPr>
+    </w:lvl>
+    <w:lvl w:ilvl="2" w:tplc="4009001B" w:tentative="1">
+      <w:start w:val="1"/>
+      <w:numFmt w:val="lowerRoman"/>
+      <w:lvlText w:val="%3."/>
+      <w:lvlJc w:val="right"/>
+      <w:pPr>
+        <w:ind w:left="2160" w:hanging="180"/>
+      </w:pPr>
+    </w:lvl>
+    <w:lvl w:ilvl="3" w:tplc="4009000F" w:tentative="1">
+      <w:start w:val="1"/>
+      <w:numFmt w:val="decimal"/>
+      <w:lvlText w:val="%4."/>
+      <w:lvlJc w:val="left"/>
+      <w:pPr>
+        <w:ind w:left="2880" w:hanging="360"/>
+      </w:pPr>
+    </w:lvl>
+    <w:lvl w:ilvl="4" w:tplc="40090019" w:tentative="1">
+      <w:start w:val="1"/>
+      <w:numFmt w:val="lowerLetter"/>
+      <w:lvlText w:val="%5."/>
+      <w:lvlJc w:val="left"/>
+      <w:pPr>
+        <w:ind w:left="3600" w:hanging="360"/>
+      </w:pPr>
+    </w:lvl>
+    <w:lvl w:ilvl="5" w:tplc="4009001B" w:tentative="1">
+      <w:start w:val="1"/>
+      <w:numFmt w:val="lowerRoman"/>
+      <w:lvlText w:val="%6."/>
+      <w:lvlJc w:val="right"/>
+      <w:pPr>
+        <w:ind w:left="4320" w:hanging="180"/>
+      </w:pPr>
+    </w:lvl>
+    <w:lvl w:ilvl="6" w:tplc="4009000F" w:tentative="1">
+      <w:start w:val="1"/>
+      <w:numFmt w:val="decimal"/>
+      <w:lvlText w:val="%7."/>
+      <w:lvlJc w:val="left"/>
+      <w:pPr>
+        <w:ind w:left="5040" w:hanging="360"/>
+      </w:pPr>
+    </w:lvl>
+    <w:lvl w:ilvl="7" w:tplc="40090019" w:tentative="1">
+      <w:start w:val="1"/>
+      <w:numFmt w:val="lowerLetter"/>
+      <w:lvlText w:val="%8."/>
+      <w:lvlJc w:val="left"/>
+      <w:pPr>
+        <w:ind w:left="5760" w:hanging="360"/>
+      </w:pPr>
+    </w:lvl>
+    <w:lvl w:ilvl="8" w:tplc="4009001B" w:tentative="1">
+      <w:start w:val="1"/>
+      <w:numFmt w:val="lowerRoman"/>
+      <w:lvlText w:val="%9."/>
+      <w:lvlJc w:val="right"/>
+      <w:pPr>
+        <w:ind w:left="6480" w:hanging="180"/>
+      </w:pPr>
+    </w:lvl>
+  </w:abstractNum>
+  <w:abstractNum w:abstractNumId="4">
+    <w:nsid w:val="387058FD"/>
+    <w:multiLevelType w:val="hybridMultilevel"/>
+    <w:tmpl w:val="BB100E0E"/>
     <w:lvl w:ilvl="0" w:tplc="40090001">
       <w:start w:val="1"/>
       <w:numFmt w:val="bullet"/>
@@ -4810,16 +5893,287 @@
       </w:rPr>
     </w:lvl>
   </w:abstractNum>
+  <w:abstractNum w:abstractNumId="5">
+    <w:nsid w:val="6B1312C0"/>
+    <w:multiLevelType w:val="multilevel"/>
+    <w:tmpl w:val="F56E21A8"/>
+    <w:lvl w:ilvl="0">
+      <w:start w:val="1"/>
+      <w:numFmt w:val="bullet"/>
+      <w:lvlText w:val=""/>
+      <w:lvlJc w:val="left"/>
+      <w:pPr>
+        <w:tabs>
+          <w:tab w:val="num" w:pos="720"/>
+        </w:tabs>
+        <w:ind w:left="720" w:hanging="360"/>
+      </w:pPr>
+      <w:rPr>
+        <w:rFonts w:ascii="Symbol" w:hAnsi="Symbol" w:hint="default"/>
+        <w:sz w:val="20"/>
+      </w:rPr>
+    </w:lvl>
+    <w:lvl w:ilvl="1" w:tentative="1">
+      <w:start w:val="1"/>
+      <w:numFmt w:val="bullet"/>
+      <w:lvlText w:val="o"/>
+      <w:lvlJc w:val="left"/>
+      <w:pPr>
+        <w:tabs>
+          <w:tab w:val="num" w:pos="1440"/>
+        </w:tabs>
+        <w:ind w:left="1440" w:hanging="360"/>
+      </w:pPr>
+      <w:rPr>
+        <w:rFonts w:ascii="Courier New" w:hAnsi="Courier New" w:hint="default"/>
+        <w:sz w:val="20"/>
+      </w:rPr>
+    </w:lvl>
+    <w:lvl w:ilvl="2" w:tentative="1">
+      <w:start w:val="1"/>
+      <w:numFmt w:val="bullet"/>
+      <w:lvlText w:val=""/>
+      <w:lvlJc w:val="left"/>
+      <w:pPr>
+        <w:tabs>
+          <w:tab w:val="num" w:pos="2160"/>
+        </w:tabs>
+        <w:ind w:left="2160" w:hanging="360"/>
+      </w:pPr>
+      <w:rPr>
+        <w:rFonts w:ascii="Wingdings" w:hAnsi="Wingdings" w:hint="default"/>
+        <w:sz w:val="20"/>
+      </w:rPr>
+    </w:lvl>
+    <w:lvl w:ilvl="3" w:tentative="1">
+      <w:start w:val="1"/>
+      <w:numFmt w:val="bullet"/>
+      <w:lvlText w:val=""/>
+      <w:lvlJc w:val="left"/>
+      <w:pPr>
+        <w:tabs>
+          <w:tab w:val="num" w:pos="2880"/>
+        </w:tabs>
+        <w:ind w:left="2880" w:hanging="360"/>
+      </w:pPr>
+      <w:rPr>
+        <w:rFonts w:ascii="Wingdings" w:hAnsi="Wingdings" w:hint="default"/>
+        <w:sz w:val="20"/>
+      </w:rPr>
+    </w:lvl>
+    <w:lvl w:ilvl="4" w:tentative="1">
+      <w:start w:val="1"/>
+      <w:numFmt w:val="bullet"/>
+      <w:lvlText w:val=""/>
+      <w:lvlJc w:val="left"/>
+      <w:pPr>
+        <w:tabs>
+          <w:tab w:val="num" w:pos="3600"/>
+        </w:tabs>
+        <w:ind w:left="3600" w:hanging="360"/>
+      </w:pPr>
+      <w:rPr>
+        <w:rFonts w:ascii="Wingdings" w:hAnsi="Wingdings" w:hint="default"/>
+        <w:sz w:val="20"/>
+      </w:rPr>
+    </w:lvl>
+    <w:lvl w:ilvl="5" w:tentative="1">
+      <w:start w:val="1"/>
+      <w:numFmt w:val="bullet"/>
+      <w:lvlText w:val=""/>
+      <w:lvlJc w:val="left"/>
+      <w:pPr>
+        <w:tabs>
+          <w:tab w:val="num" w:pos="4320"/>
+        </w:tabs>
+        <w:ind w:left="4320" w:hanging="360"/>
+      </w:pPr>
+      <w:rPr>
+        <w:rFonts w:ascii="Wingdings" w:hAnsi="Wingdings" w:hint="default"/>
+        <w:sz w:val="20"/>
+      </w:rPr>
+    </w:lvl>
+    <w:lvl w:ilvl="6" w:tentative="1">
+      <w:start w:val="1"/>
+      <w:numFmt w:val="bullet"/>
+      <w:lvlText w:val=""/>
+      <w:lvlJc w:val="left"/>
+      <w:pPr>
+        <w:tabs>
+          <w:tab w:val="num" w:pos="5040"/>
+        </w:tabs>
+        <w:ind w:left="5040" w:hanging="360"/>
+      </w:pPr>
+      <w:rPr>
+        <w:rFonts w:ascii="Wingdings" w:hAnsi="Wingdings" w:hint="default"/>
+        <w:sz w:val="20"/>
+      </w:rPr>
+    </w:lvl>
+    <w:lvl w:ilvl="7" w:tentative="1">
+      <w:start w:val="1"/>
+      <w:numFmt w:val="bullet"/>
+      <w:lvlText w:val=""/>
+      <w:lvlJc w:val="left"/>
+      <w:pPr>
+        <w:tabs>
+          <w:tab w:val="num" w:pos="5760"/>
+        </w:tabs>
+        <w:ind w:left="5760" w:hanging="360"/>
+      </w:pPr>
+      <w:rPr>
+        <w:rFonts w:ascii="Wingdings" w:hAnsi="Wingdings" w:hint="default"/>
+        <w:sz w:val="20"/>
+      </w:rPr>
+    </w:lvl>
+    <w:lvl w:ilvl="8" w:tentative="1">
+      <w:start w:val="1"/>
+      <w:numFmt w:val="bullet"/>
+      <w:lvlText w:val=""/>
+      <w:lvlJc w:val="left"/>
+      <w:pPr>
+        <w:tabs>
+          <w:tab w:val="num" w:pos="6480"/>
+        </w:tabs>
+        <w:ind w:left="6480" w:hanging="360"/>
+      </w:pPr>
+      <w:rPr>
+        <w:rFonts w:ascii="Wingdings" w:hAnsi="Wingdings" w:hint="default"/>
+        <w:sz w:val="20"/>
+      </w:rPr>
+    </w:lvl>
+  </w:abstractNum>
+  <w:abstractNum w:abstractNumId="6">
+    <w:nsid w:val="769E6830"/>
+    <w:multiLevelType w:val="hybridMultilevel"/>
+    <w:tmpl w:val="9196B5D2"/>
+    <w:lvl w:ilvl="0" w:tplc="40090001">
+      <w:start w:val="1"/>
+      <w:numFmt w:val="bullet"/>
+      <w:lvlText w:val=""/>
+      <w:lvlJc w:val="left"/>
+      <w:pPr>
+        <w:ind w:left="720" w:hanging="360"/>
+      </w:pPr>
+      <w:rPr>
+        <w:rFonts w:ascii="Symbol" w:hAnsi="Symbol" w:hint="default"/>
+      </w:rPr>
+    </w:lvl>
+    <w:lvl w:ilvl="1" w:tplc="40090003" w:tentative="1">
+      <w:start w:val="1"/>
+      <w:numFmt w:val="bullet"/>
+      <w:lvlText w:val="o"/>
+      <w:lvlJc w:val="left"/>
+      <w:pPr>
+        <w:ind w:left="1440" w:hanging="360"/>
+      </w:pPr>
+      <w:rPr>
+        <w:rFonts w:ascii="Courier New" w:hAnsi="Courier New" w:cs="Courier New" w:hint="default"/>
+      </w:rPr>
+    </w:lvl>
+    <w:lvl w:ilvl="2" w:tplc="40090005" w:tentative="1">
+      <w:start w:val="1"/>
+      <w:numFmt w:val="bullet"/>
+      <w:lvlText w:val=""/>
+      <w:lvlJc w:val="left"/>
+      <w:pPr>
+        <w:ind w:left="2160" w:hanging="360"/>
+      </w:pPr>
+      <w:rPr>
+        <w:rFonts w:ascii="Wingdings" w:hAnsi="Wingdings" w:hint="default"/>
+      </w:rPr>
+    </w:lvl>
+    <w:lvl w:ilvl="3" w:tplc="40090001" w:tentative="1">
+      <w:start w:val="1"/>
+      <w:numFmt w:val="bullet"/>
+      <w:lvlText w:val=""/>
+      <w:lvlJc w:val="left"/>
+      <w:pPr>
+        <w:ind w:left="2880" w:hanging="360"/>
+      </w:pPr>
+      <w:rPr>
+        <w:rFonts w:ascii="Symbol" w:hAnsi="Symbol" w:hint="default"/>
+      </w:rPr>
+    </w:lvl>
+    <w:lvl w:ilvl="4" w:tplc="40090003" w:tentative="1">
+      <w:start w:val="1"/>
+      <w:numFmt w:val="bullet"/>
+      <w:lvlText w:val="o"/>
+      <w:lvlJc w:val="left"/>
+      <w:pPr>
+        <w:ind w:left="3600" w:hanging="360"/>
+      </w:pPr>
+      <w:rPr>
+        <w:rFonts w:ascii="Courier New" w:hAnsi="Courier New" w:cs="Courier New" w:hint="default"/>
+      </w:rPr>
+    </w:lvl>
+    <w:lvl w:ilvl="5" w:tplc="40090005" w:tentative="1">
+      <w:start w:val="1"/>
+      <w:numFmt w:val="bullet"/>
+      <w:lvlText w:val=""/>
+      <w:lvlJc w:val="left"/>
+      <w:pPr>
+        <w:ind w:left="4320" w:hanging="360"/>
+      </w:pPr>
+      <w:rPr>
+        <w:rFonts w:ascii="Wingdings" w:hAnsi="Wingdings" w:hint="default"/>
+      </w:rPr>
+    </w:lvl>
+    <w:lvl w:ilvl="6" w:tplc="40090001" w:tentative="1">
+      <w:start w:val="1"/>
+      <w:numFmt w:val="bullet"/>
+      <w:lvlText w:val=""/>
+      <w:lvlJc w:val="left"/>
+      <w:pPr>
+        <w:ind w:left="5040" w:hanging="360"/>
+      </w:pPr>
+      <w:rPr>
+        <w:rFonts w:ascii="Symbol" w:hAnsi="Symbol" w:hint="default"/>
+      </w:rPr>
+    </w:lvl>
+    <w:lvl w:ilvl="7" w:tplc="40090003" w:tentative="1">
+      <w:start w:val="1"/>
+      <w:numFmt w:val="bullet"/>
+      <w:lvlText w:val="o"/>
+      <w:lvlJc w:val="left"/>
+      <w:pPr>
+        <w:ind w:left="5760" w:hanging="360"/>
+      </w:pPr>
+      <w:rPr>
+        <w:rFonts w:ascii="Courier New" w:hAnsi="Courier New" w:cs="Courier New" w:hint="default"/>
+      </w:rPr>
+    </w:lvl>
+    <w:lvl w:ilvl="8" w:tplc="40090005" w:tentative="1">
+      <w:start w:val="1"/>
+      <w:numFmt w:val="bullet"/>
+      <w:lvlText w:val=""/>
+      <w:lvlJc w:val="left"/>
+      <w:pPr>
+        <w:ind w:left="6480" w:hanging="360"/>
+      </w:pPr>
+      <w:rPr>
+        <w:rFonts w:ascii="Wingdings" w:hAnsi="Wingdings" w:hint="default"/>
+      </w:rPr>
+    </w:lvl>
+  </w:abstractNum>
   <w:num w:numId="1">
+    <w:abstractNumId w:val="4"/>
+  </w:num>
+  <w:num w:numId="2">
+    <w:abstractNumId w:val="6"/>
+  </w:num>
+  <w:num w:numId="3">
     <w:abstractNumId w:val="2"/>
   </w:num>
-  <w:num w:numId="2">
+  <w:num w:numId="4">
     <w:abstractNumId w:val="3"/>
   </w:num>
-  <w:num w:numId="3">
+  <w:num w:numId="5">
+    <w:abstractNumId w:val="5"/>
+  </w:num>
+  <w:num w:numId="6">
     <w:abstractNumId w:val="0"/>
   </w:num>
-  <w:num w:numId="4">
+  <w:num w:numId="7">
     <w:abstractNumId w:val="1"/>
   </w:num>
 </w:numbering>
@@ -5146,6 +6500,23 @@
       <w:contextualSpacing/>
     </w:pPr>
   </w:style>
+  <w:style w:type="character" w:styleId="Hyperlink">
+    <w:name w:val="Hyperlink"/>
+    <w:basedOn w:val="DefaultParagraphFont"/>
+    <w:uiPriority w:val="99"/>
+    <w:semiHidden/>
+    <w:unhideWhenUsed/>
+    <w:rsid w:val="001B1F89"/>
+    <w:rPr>
+      <w:color w:val="0000FF"/>
+      <w:u w:val="single"/>
+    </w:rPr>
+  </w:style>
+  <w:style w:type="character" w:customStyle="1" w:styleId="t286pc">
+    <w:name w:val="t286pc"/>
+    <w:basedOn w:val="DefaultParagraphFont"/>
+    <w:rsid w:val="001B1F89"/>
+  </w:style>
 </w:styles>
 </file>
 
@@ -5470,6 +6841,23 @@
       <w:contextualSpacing/>
     </w:pPr>
   </w:style>
+  <w:style w:type="character" w:styleId="Hyperlink">
+    <w:name w:val="Hyperlink"/>
+    <w:basedOn w:val="DefaultParagraphFont"/>
+    <w:uiPriority w:val="99"/>
+    <w:semiHidden/>
+    <w:unhideWhenUsed/>
+    <w:rsid w:val="001B1F89"/>
+    <w:rPr>
+      <w:color w:val="0000FF"/>
+      <w:u w:val="single"/>
+    </w:rPr>
+  </w:style>
+  <w:style w:type="character" w:customStyle="1" w:styleId="t286pc">
+    <w:name w:val="t286pc"/>
+    <w:basedOn w:val="DefaultParagraphFont"/>
+    <w:rsid w:val="001B1F89"/>
+  </w:style>
 </w:styles>
 </file>
 

</xml_diff>